<commit_message>
Exploración inicial de BD-Embalses
</commit_message>
<xml_diff>
--- a/docs/Proyecto Observatorio Sequia Guadalquivir.docx
+++ b/docs/Proyecto Observatorio Sequia Guadalquivir.docx
@@ -168,7 +168,19 @@
         <w:rPr>
           <w:lang w:val="es-ES_tradnl"/>
         </w:rPr>
-        <w:t xml:space="preserve">) y de la cuenca a 4 y 8 meses. </w:t>
+        <w:t xml:space="preserve">) y de la cuenca a 4 y 8 </w:t>
+      </w:r>
+      <w:r>
+        <w:rPr>
+          <w:lang w:val="es-ES_tradnl"/>
+        </w:rPr>
+        <w:t>semanas</w:t>
+      </w:r>
+      <w:r>
+        <w:rPr>
+          <w:lang w:val="es-ES_tradnl"/>
+        </w:rPr>
+        <w:t xml:space="preserve">. </w:t>
       </w:r>
     </w:p>
     <w:p>
@@ -558,6 +570,302 @@
         </w:rPr>
         <w:t>qué funciones, límites y siguientes pasos.</w:t>
       </w:r>
+    </w:p>
+    <w:p>
+      <w:pPr>
+        <w:rPr>
+          <w:color w:val="EE0000"/>
+          <w:lang w:val="es-ES_tradnl"/>
+        </w:rPr>
+      </w:pPr>
+    </w:p>
+    <w:p>
+      <w:pPr>
+        <w:rPr>
+          <w:color w:val="EE0000"/>
+          <w:lang w:val="es-ES_tradnl"/>
+        </w:rPr>
+      </w:pPr>
+      <w:r>
+        <w:rPr>
+          <w:color w:val="EE0000"/>
+          <w:lang w:val="es-ES_tradnl"/>
+        </w:rPr>
+        <w:t xml:space="preserve">4. Estructura datos </w:t>
+      </w:r>
+      <w:r>
+        <w:rPr>
+          <w:color w:val="EE0000"/>
+          <w:lang w:val="es-ES_tradnl"/>
+        </w:rPr>
+        <w:t xml:space="preserve">embalses </w:t>
+      </w:r>
+    </w:p>
+    <w:p>
+      <w:pPr>
+        <w:rPr>
+          <w:lang w:val="es-ES_tradnl"/>
+        </w:rPr>
+      </w:pPr>
+      <w:r>
+        <w:rPr>
+          <w:lang w:val="es-ES_tradnl"/>
+        </w:rPr>
+        <w:drawing>
+          <wp:inline distT="0" distB="0" distL="0" distR="0" wp14:anchorId="0FD8A9C5" wp14:editId="28CF0ECC">
+            <wp:extent cx="4606636" cy="1193370"/>
+            <wp:effectExtent l="0" t="0" r="3810" b="635"/>
+            <wp:docPr id="1759964579" name="Imagen 1"/>
+            <wp:cNvGraphicFramePr>
+              <a:graphicFrameLocks xmlns:a="http://schemas.openxmlformats.org/drawingml/2006/main" noChangeAspect="1"/>
+            </wp:cNvGraphicFramePr>
+            <a:graphic xmlns:a="http://schemas.openxmlformats.org/drawingml/2006/main">
+              <a:graphicData uri="http://schemas.openxmlformats.org/drawingml/2006/picture">
+                <pic:pic xmlns:pic="http://schemas.openxmlformats.org/drawingml/2006/picture">
+                  <pic:nvPicPr>
+                    <pic:cNvPr id="1759964579" name=""/>
+                    <pic:cNvPicPr/>
+                  </pic:nvPicPr>
+                  <pic:blipFill>
+                    <a:blip r:embed="rId5"/>
+                    <a:stretch>
+                      <a:fillRect/>
+                    </a:stretch>
+                  </pic:blipFill>
+                  <pic:spPr>
+                    <a:xfrm>
+                      <a:off x="0" y="0"/>
+                      <a:ext cx="4673359" cy="1210655"/>
+                    </a:xfrm>
+                    <a:prstGeom prst="rect">
+                      <a:avLst/>
+                    </a:prstGeom>
+                  </pic:spPr>
+                </pic:pic>
+              </a:graphicData>
+            </a:graphic>
+          </wp:inline>
+        </w:drawing>
+      </w:r>
+    </w:p>
+    <w:p>
+      <w:pPr>
+        <w:rPr>
+          <w:lang w:val="es-ES_tradnl"/>
+        </w:rPr>
+      </w:pPr>
+    </w:p>
+    <w:p>
+      <w:pPr>
+        <w:rPr>
+          <w:lang w:val="es-ES_tradnl"/>
+        </w:rPr>
+      </w:pPr>
+    </w:p>
+    <w:p>
+      <w:pPr>
+        <w:rPr>
+          <w:lang w:val="es-ES_tradnl"/>
+        </w:rPr>
+      </w:pPr>
+    </w:p>
+    <w:p>
+      <w:pPr>
+        <w:rPr>
+          <w:lang w:val="es-ES_tradnl"/>
+        </w:rPr>
+      </w:pPr>
+    </w:p>
+    <w:p>
+      <w:pPr>
+        <w:rPr>
+          <w:lang w:val="es-ES_tradnl"/>
+        </w:rPr>
+      </w:pPr>
+    </w:p>
+    <w:p>
+      <w:pPr>
+        <w:rPr>
+          <w:lang w:val="es-ES_tradnl"/>
+        </w:rPr>
+      </w:pPr>
+    </w:p>
+    <w:p>
+      <w:pPr>
+        <w:rPr>
+          <w:lang w:val="es-ES_tradnl"/>
+        </w:rPr>
+      </w:pPr>
+    </w:p>
+    <w:p>
+      <w:pPr>
+        <w:rPr>
+          <w:lang w:val="es-ES_tradnl"/>
+        </w:rPr>
+      </w:pPr>
+    </w:p>
+    <w:p>
+      <w:pPr>
+        <w:rPr>
+          <w:lang w:val="es-ES_tradnl"/>
+        </w:rPr>
+      </w:pPr>
+    </w:p>
+    <w:p>
+      <w:pPr>
+        <w:rPr>
+          <w:lang w:val="es-ES_tradnl"/>
+        </w:rPr>
+      </w:pPr>
+    </w:p>
+    <w:p>
+      <w:pPr>
+        <w:rPr>
+          <w:lang w:val="es-ES_tradnl"/>
+        </w:rPr>
+      </w:pPr>
+    </w:p>
+    <w:p>
+      <w:pPr>
+        <w:rPr>
+          <w:lang w:val="es-ES_tradnl"/>
+        </w:rPr>
+      </w:pPr>
+    </w:p>
+    <w:p>
+      <w:pPr>
+        <w:rPr>
+          <w:lang w:val="es-ES_tradnl"/>
+        </w:rPr>
+      </w:pPr>
+    </w:p>
+    <w:p>
+      <w:pPr>
+        <w:rPr>
+          <w:lang w:val="es-ES_tradnl"/>
+        </w:rPr>
+      </w:pPr>
+    </w:p>
+    <w:p>
+      <w:pPr>
+        <w:rPr>
+          <w:lang w:val="es-ES_tradnl"/>
+        </w:rPr>
+      </w:pPr>
+    </w:p>
+    <w:p>
+      <w:pPr>
+        <w:rPr>
+          <w:lang w:val="es-ES_tradnl"/>
+        </w:rPr>
+      </w:pPr>
+    </w:p>
+    <w:p>
+      <w:pPr>
+        <w:rPr>
+          <w:lang w:val="es-ES_tradnl"/>
+        </w:rPr>
+      </w:pPr>
+    </w:p>
+    <w:p>
+      <w:pPr>
+        <w:rPr>
+          <w:lang w:val="es-ES_tradnl"/>
+        </w:rPr>
+      </w:pPr>
+    </w:p>
+    <w:p>
+      <w:pPr>
+        <w:rPr>
+          <w:lang w:val="es-ES_tradnl"/>
+        </w:rPr>
+      </w:pPr>
+    </w:p>
+    <w:p>
+      <w:pPr>
+        <w:rPr>
+          <w:lang w:val="es-ES_tradnl"/>
+        </w:rPr>
+      </w:pPr>
+    </w:p>
+    <w:p>
+      <w:pPr>
+        <w:rPr>
+          <w:lang w:val="es-ES_tradnl"/>
+        </w:rPr>
+      </w:pPr>
+    </w:p>
+    <w:p>
+      <w:pPr>
+        <w:rPr>
+          <w:lang w:val="es-ES_tradnl"/>
+        </w:rPr>
+      </w:pPr>
+    </w:p>
+    <w:p>
+      <w:pPr>
+        <w:rPr>
+          <w:lang w:val="es-ES_tradnl"/>
+        </w:rPr>
+      </w:pPr>
+    </w:p>
+    <w:p>
+      <w:pPr>
+        <w:rPr>
+          <w:lang w:val="es-ES_tradnl"/>
+        </w:rPr>
+      </w:pPr>
+    </w:p>
+    <w:p>
+      <w:pPr>
+        <w:rPr>
+          <w:lang w:val="es-ES_tradnl"/>
+        </w:rPr>
+      </w:pPr>
+    </w:p>
+    <w:p>
+      <w:pPr>
+        <w:rPr>
+          <w:lang w:val="es-ES_tradnl"/>
+        </w:rPr>
+      </w:pPr>
+    </w:p>
+    <w:p>
+      <w:pPr>
+        <w:rPr>
+          <w:lang w:val="es-ES_tradnl"/>
+        </w:rPr>
+      </w:pPr>
+    </w:p>
+    <w:p>
+      <w:pPr>
+        <w:rPr>
+          <w:lang w:val="es-ES_tradnl"/>
+        </w:rPr>
+      </w:pPr>
+    </w:p>
+    <w:p>
+      <w:pPr>
+        <w:rPr>
+          <w:color w:val="EE0000"/>
+          <w:lang w:val="es-ES_tradnl"/>
+        </w:rPr>
+      </w:pPr>
+      <w:r>
+        <w:rPr>
+          <w:color w:val="EE0000"/>
+          <w:lang w:val="es-ES_tradnl"/>
+        </w:rPr>
+        <w:lastRenderedPageBreak/>
+        <w:t>Conceptos nuevos/repaso:</w:t>
+      </w:r>
+    </w:p>
+    <w:p>
+      <w:pPr>
+        <w:rPr>
+          <w:lang w:val="es-ES_tradnl"/>
+        </w:rPr>
+      </w:pPr>
     </w:p>
     <w:sectPr>
       <w:pgSz w:w="11906" w:h="16838"/>

</xml_diff>

<commit_message>
Limpieza de embalses y serie semanal de la cuenca
</commit_message>
<xml_diff>
--- a/docs/Proyecto Observatorio Sequia Guadalquivir.docx
+++ b/docs/Proyecto Observatorio Sequia Guadalquivir.docx
@@ -609,6 +609,7 @@
       </w:pPr>
       <w:r>
         <w:rPr>
+          <w:noProof/>
           <w:lang w:val="es-ES_tradnl"/>
         </w:rPr>
         <w:drawing>
@@ -651,202 +652,6 @@
     <w:p>
       <w:pPr>
         <w:rPr>
-          <w:lang w:val="es-ES_tradnl"/>
-        </w:rPr>
-      </w:pPr>
-    </w:p>
-    <w:p>
-      <w:pPr>
-        <w:rPr>
-          <w:lang w:val="es-ES_tradnl"/>
-        </w:rPr>
-      </w:pPr>
-    </w:p>
-    <w:p>
-      <w:pPr>
-        <w:rPr>
-          <w:lang w:val="es-ES_tradnl"/>
-        </w:rPr>
-      </w:pPr>
-    </w:p>
-    <w:p>
-      <w:pPr>
-        <w:rPr>
-          <w:lang w:val="es-ES_tradnl"/>
-        </w:rPr>
-      </w:pPr>
-    </w:p>
-    <w:p>
-      <w:pPr>
-        <w:rPr>
-          <w:lang w:val="es-ES_tradnl"/>
-        </w:rPr>
-      </w:pPr>
-    </w:p>
-    <w:p>
-      <w:pPr>
-        <w:rPr>
-          <w:lang w:val="es-ES_tradnl"/>
-        </w:rPr>
-      </w:pPr>
-    </w:p>
-    <w:p>
-      <w:pPr>
-        <w:rPr>
-          <w:lang w:val="es-ES_tradnl"/>
-        </w:rPr>
-      </w:pPr>
-    </w:p>
-    <w:p>
-      <w:pPr>
-        <w:rPr>
-          <w:lang w:val="es-ES_tradnl"/>
-        </w:rPr>
-      </w:pPr>
-    </w:p>
-    <w:p>
-      <w:pPr>
-        <w:rPr>
-          <w:lang w:val="es-ES_tradnl"/>
-        </w:rPr>
-      </w:pPr>
-    </w:p>
-    <w:p>
-      <w:pPr>
-        <w:rPr>
-          <w:lang w:val="es-ES_tradnl"/>
-        </w:rPr>
-      </w:pPr>
-    </w:p>
-    <w:p>
-      <w:pPr>
-        <w:rPr>
-          <w:lang w:val="es-ES_tradnl"/>
-        </w:rPr>
-      </w:pPr>
-    </w:p>
-    <w:p>
-      <w:pPr>
-        <w:rPr>
-          <w:lang w:val="es-ES_tradnl"/>
-        </w:rPr>
-      </w:pPr>
-    </w:p>
-    <w:p>
-      <w:pPr>
-        <w:rPr>
-          <w:lang w:val="es-ES_tradnl"/>
-        </w:rPr>
-      </w:pPr>
-    </w:p>
-    <w:p>
-      <w:pPr>
-        <w:rPr>
-          <w:lang w:val="es-ES_tradnl"/>
-        </w:rPr>
-      </w:pPr>
-    </w:p>
-    <w:p>
-      <w:pPr>
-        <w:rPr>
-          <w:lang w:val="es-ES_tradnl"/>
-        </w:rPr>
-      </w:pPr>
-    </w:p>
-    <w:p>
-      <w:pPr>
-        <w:rPr>
-          <w:lang w:val="es-ES_tradnl"/>
-        </w:rPr>
-      </w:pPr>
-    </w:p>
-    <w:p>
-      <w:pPr>
-        <w:rPr>
-          <w:lang w:val="es-ES_tradnl"/>
-        </w:rPr>
-      </w:pPr>
-    </w:p>
-    <w:p>
-      <w:pPr>
-        <w:rPr>
-          <w:lang w:val="es-ES_tradnl"/>
-        </w:rPr>
-      </w:pPr>
-    </w:p>
-    <w:p>
-      <w:pPr>
-        <w:rPr>
-          <w:lang w:val="es-ES_tradnl"/>
-        </w:rPr>
-      </w:pPr>
-    </w:p>
-    <w:p>
-      <w:pPr>
-        <w:rPr>
-          <w:lang w:val="es-ES_tradnl"/>
-        </w:rPr>
-      </w:pPr>
-    </w:p>
-    <w:p>
-      <w:pPr>
-        <w:rPr>
-          <w:lang w:val="es-ES_tradnl"/>
-        </w:rPr>
-      </w:pPr>
-    </w:p>
-    <w:p>
-      <w:pPr>
-        <w:rPr>
-          <w:lang w:val="es-ES_tradnl"/>
-        </w:rPr>
-      </w:pPr>
-    </w:p>
-    <w:p>
-      <w:pPr>
-        <w:rPr>
-          <w:lang w:val="es-ES_tradnl"/>
-        </w:rPr>
-      </w:pPr>
-    </w:p>
-    <w:p>
-      <w:pPr>
-        <w:rPr>
-          <w:lang w:val="es-ES_tradnl"/>
-        </w:rPr>
-      </w:pPr>
-    </w:p>
-    <w:p>
-      <w:pPr>
-        <w:rPr>
-          <w:lang w:val="es-ES_tradnl"/>
-        </w:rPr>
-      </w:pPr>
-    </w:p>
-    <w:p>
-      <w:pPr>
-        <w:rPr>
-          <w:lang w:val="es-ES_tradnl"/>
-        </w:rPr>
-      </w:pPr>
-    </w:p>
-    <w:p>
-      <w:pPr>
-        <w:rPr>
-          <w:lang w:val="es-ES_tradnl"/>
-        </w:rPr>
-      </w:pPr>
-    </w:p>
-    <w:p>
-      <w:pPr>
-        <w:rPr>
-          <w:lang w:val="es-ES_tradnl"/>
-        </w:rPr>
-      </w:pPr>
-    </w:p>
-    <w:p>
-      <w:pPr>
-        <w:rPr>
           <w:color w:val="EE0000"/>
           <w:lang w:val="es-ES_tradnl"/>
         </w:rPr>
@@ -857,15 +662,730 @@
           <w:lang w:val="es-ES_tradnl"/>
         </w:rPr>
         <w:lastRenderedPageBreak/>
+        <w:t>5. Limpieza de datos</w:t>
+      </w:r>
+    </w:p>
+    <w:p>
+      <w:pPr>
+        <w:pStyle w:val="Prrafodelista"/>
+        <w:numPr>
+          <w:ilvl w:val="0"/>
+          <w:numId w:val="2"/>
+        </w:numPr>
+        <w:rPr>
+          <w:lang w:val="es-ES_tradnl"/>
+        </w:rPr>
+      </w:pPr>
+      <w:r>
+        <w:rPr>
+          <w:b/>
+          <w:bCs/>
+          <w:lang w:val="es-ES_tradnl"/>
+        </w:rPr>
+        <w:t>Qué es:</w:t>
+      </w:r>
+      <w:r>
+        <w:rPr>
+          <w:lang w:val="es-ES_tradnl"/>
+        </w:rPr>
+        <w:t xml:space="preserve"> dejar los datos de embalses listos para el modelo, quitamos errores y todo lo que crea saltos </w:t>
+      </w:r>
+      <w:r>
+        <w:rPr>
+          <w:lang w:val="es-ES_tradnl"/>
+        </w:rPr>
+        <w:t>artificiales</w:t>
+      </w:r>
+      <w:r>
+        <w:rPr>
+          <w:lang w:val="es-ES_tradnl"/>
+        </w:rPr>
+        <w:t xml:space="preserve"> en el volumen de la cuenca.</w:t>
+      </w:r>
+    </w:p>
+    <w:p>
+      <w:pPr>
+        <w:pStyle w:val="Prrafodelista"/>
+        <w:numPr>
+          <w:ilvl w:val="0"/>
+          <w:numId w:val="2"/>
+        </w:numPr>
+        <w:rPr>
+          <w:lang w:val="es-ES_tradnl"/>
+        </w:rPr>
+      </w:pPr>
+      <w:r>
+        <w:rPr>
+          <w:b/>
+          <w:bCs/>
+          <w:lang w:val="es-ES_tradnl"/>
+        </w:rPr>
+        <w:t>Resultado:</w:t>
+      </w:r>
+      <w:r>
+        <w:rPr>
+          <w:lang w:val="es-ES_tradnl"/>
+        </w:rPr>
+        <w:t xml:space="preserve"> 36 embalses x 1.708 semanas (feb 1994 – oct 2026) = 61.488 filas, sin huecos.</w:t>
+      </w:r>
+    </w:p>
+    <w:p>
+      <w:pPr>
+        <w:rPr>
+          <w:color w:val="00B050"/>
+          <w:lang w:val="es-ES_tradnl"/>
+        </w:rPr>
+      </w:pPr>
+      <w:r>
+        <w:rPr>
+          <w:color w:val="00B050"/>
+          <w:lang w:val="es-ES_tradnl"/>
+        </w:rPr>
+        <w:t>Decisiones tomadas:</w:t>
+      </w:r>
+    </w:p>
+    <w:p>
+      <w:pPr>
+        <w:pStyle w:val="Prrafodelista"/>
+        <w:numPr>
+          <w:ilvl w:val="0"/>
+          <w:numId w:val="2"/>
+        </w:numPr>
+        <w:rPr>
+          <w:lang w:val="es-ES_tradnl"/>
+        </w:rPr>
+      </w:pPr>
+      <w:r>
+        <w:rPr>
+          <w:color w:val="0070C0"/>
+          <w:lang w:val="es-ES_tradnl"/>
+        </w:rPr>
+        <w:t xml:space="preserve">Solo Guadalquivir y embalses consuntivos (riego y abastecimiento): </w:t>
+      </w:r>
+      <w:r>
+        <w:rPr>
+          <w:lang w:val="es-ES_tradnl"/>
+        </w:rPr>
+        <w:t xml:space="preserve">los hidroeléctricos dependen del mercado </w:t>
+      </w:r>
+      <w:r>
+        <w:rPr>
+          <w:lang w:val="es-ES_tradnl"/>
+        </w:rPr>
+        <w:t>eléctrico</w:t>
+      </w:r>
+      <w:r>
+        <w:rPr>
+          <w:lang w:val="es-ES_tradnl"/>
+        </w:rPr>
+        <w:t xml:space="preserve">, no de la </w:t>
+      </w:r>
+      <w:r>
+        <w:rPr>
+          <w:lang w:val="es-ES_tradnl"/>
+        </w:rPr>
+        <w:t>sequía</w:t>
+      </w:r>
+      <w:r>
+        <w:rPr>
+          <w:lang w:val="es-ES_tradnl"/>
+        </w:rPr>
+        <w:t>.</w:t>
+      </w:r>
+    </w:p>
+    <w:p>
+      <w:pPr>
+        <w:pStyle w:val="Prrafodelista"/>
+        <w:numPr>
+          <w:ilvl w:val="0"/>
+          <w:numId w:val="2"/>
+        </w:numPr>
+        <w:rPr>
+          <w:lang w:val="es-ES_tradnl"/>
+        </w:rPr>
+      </w:pPr>
+      <w:r>
+        <w:rPr>
+          <w:color w:val="0070C0"/>
+          <w:lang w:val="es-ES_tradnl"/>
+        </w:rPr>
+        <w:t xml:space="preserve">Quitar capacidad 0: </w:t>
+      </w:r>
+      <w:r>
+        <w:rPr>
+          <w:lang w:val="es-ES_tradnl"/>
+        </w:rPr>
+        <w:t>significa que el embalse aun no estaba en el servicio.</w:t>
+      </w:r>
+    </w:p>
+    <w:p>
+      <w:pPr>
+        <w:pStyle w:val="Prrafodelista"/>
+        <w:numPr>
+          <w:ilvl w:val="0"/>
+          <w:numId w:val="2"/>
+        </w:numPr>
+        <w:rPr>
+          <w:lang w:val="es-ES_tradnl"/>
+        </w:rPr>
+      </w:pPr>
+      <w:r>
+        <w:rPr>
+          <w:color w:val="0070C0"/>
+          <w:lang w:val="es-ES_tradnl"/>
+        </w:rPr>
+        <w:t xml:space="preserve">Quitar capacidades erróneas en el </w:t>
+      </w:r>
+      <w:r>
+        <w:rPr>
+          <w:color w:val="0070C0"/>
+          <w:lang w:val="es-ES_tradnl"/>
+        </w:rPr>
+        <w:t>arranque</w:t>
+      </w:r>
+      <w:r>
+        <w:rPr>
+          <w:color w:val="0070C0"/>
+          <w:lang w:val="es-ES_tradnl"/>
+        </w:rPr>
+        <w:t xml:space="preserve"> (</w:t>
+      </w:r>
+      <w:proofErr w:type="spellStart"/>
+      <w:r>
+        <w:rPr>
+          <w:color w:val="0070C0"/>
+          <w:lang w:val="es-ES_tradnl"/>
+        </w:rPr>
+        <w:t>Negratin</w:t>
+      </w:r>
+      <w:proofErr w:type="spellEnd"/>
+      <w:r>
+        <w:rPr>
+          <w:color w:val="0070C0"/>
+          <w:lang w:val="es-ES_tradnl"/>
+        </w:rPr>
+        <w:t xml:space="preserve"> 100, </w:t>
+      </w:r>
+      <w:proofErr w:type="spellStart"/>
+      <w:r>
+        <w:rPr>
+          <w:color w:val="0070C0"/>
+          <w:lang w:val="es-ES_tradnl"/>
+        </w:rPr>
+        <w:t>Giribaile</w:t>
+      </w:r>
+      <w:proofErr w:type="spellEnd"/>
+      <w:r>
+        <w:rPr>
+          <w:color w:val="0070C0"/>
+          <w:lang w:val="es-ES_tradnl"/>
+        </w:rPr>
+        <w:t xml:space="preserve"> 5): </w:t>
+      </w:r>
+      <w:r>
+        <w:rPr>
+          <w:lang w:val="es-ES_tradnl"/>
+        </w:rPr>
+        <w:t>duran pocas semanas y no son reales.</w:t>
+      </w:r>
+    </w:p>
+    <w:p>
+      <w:pPr>
+        <w:pStyle w:val="Prrafodelista"/>
+        <w:numPr>
+          <w:ilvl w:val="0"/>
+          <w:numId w:val="2"/>
+        </w:numPr>
+        <w:rPr>
+          <w:color w:val="0070C0"/>
+          <w:lang w:val="es-ES_tradnl"/>
+        </w:rPr>
+      </w:pPr>
+      <w:r>
+        <w:rPr>
+          <w:color w:val="0070C0"/>
+          <w:lang w:val="es-ES_tradnl"/>
+        </w:rPr>
+        <w:t xml:space="preserve">Mantener el volumen mayor que la capacidad </w:t>
+      </w:r>
+    </w:p>
+    <w:p>
+      <w:pPr>
+        <w:pStyle w:val="Prrafodelista"/>
+        <w:numPr>
+          <w:ilvl w:val="0"/>
+          <w:numId w:val="2"/>
+        </w:numPr>
+        <w:rPr>
+          <w:lang w:val="es-ES_tradnl"/>
+        </w:rPr>
+      </w:pPr>
+      <w:r>
+        <w:rPr>
+          <w:color w:val="0070C0"/>
+          <w:lang w:val="es-ES_tradnl"/>
+        </w:rPr>
+        <w:t xml:space="preserve">Periodo desde febrero de 1994: </w:t>
+      </w:r>
+      <w:r>
+        <w:rPr>
+          <w:lang w:val="es-ES_tradnl"/>
+        </w:rPr>
+        <w:t xml:space="preserve">mejor equilibrio entre historia y cobertura (84% de la cuenca). Incluye la peor </w:t>
+      </w:r>
+      <w:r>
+        <w:rPr>
+          <w:lang w:val="es-ES_tradnl"/>
+        </w:rPr>
+        <w:t>sequía</w:t>
+      </w:r>
+      <w:r>
+        <w:rPr>
+          <w:lang w:val="es-ES_tradnl"/>
+        </w:rPr>
+        <w:t xml:space="preserve"> (1995) y la recuperación 1996.</w:t>
+      </w:r>
+    </w:p>
+    <w:p>
+      <w:pPr>
+        <w:pStyle w:val="Prrafodelista"/>
+        <w:numPr>
+          <w:ilvl w:val="0"/>
+          <w:numId w:val="2"/>
+        </w:numPr>
+        <w:rPr>
+          <w:lang w:val="es-ES_tradnl"/>
+        </w:rPr>
+      </w:pPr>
+      <w:r>
+        <w:rPr>
+          <w:color w:val="0070C0"/>
+          <w:lang w:val="es-ES_tradnl"/>
+        </w:rPr>
+        <w:t xml:space="preserve">Solo embalses con datos todas las semanas: </w:t>
+      </w:r>
+      <w:r>
+        <w:rPr>
+          <w:lang w:val="es-ES_tradnl"/>
+        </w:rPr>
+        <w:t xml:space="preserve">si entran o salen embalses, el total da saltos que no son lluvia ni sequia. </w:t>
+      </w:r>
+    </w:p>
+    <w:p>
+      <w:pPr>
+        <w:pStyle w:val="Prrafodelista"/>
+        <w:numPr>
+          <w:ilvl w:val="0"/>
+          <w:numId w:val="2"/>
+        </w:numPr>
+        <w:rPr>
+          <w:lang w:val="es-ES_tradnl"/>
+        </w:rPr>
+      </w:pPr>
+      <w:r>
+        <w:rPr>
+          <w:color w:val="0070C0"/>
+          <w:lang w:val="es-ES_tradnl"/>
+        </w:rPr>
+        <w:t xml:space="preserve">Quitar La Breña: </w:t>
+      </w:r>
+      <w:r>
+        <w:rPr>
+          <w:lang w:val="es-ES_tradnl"/>
+        </w:rPr>
+        <w:t xml:space="preserve">en 2009 pasa de 100 a </w:t>
+      </w:r>
+      <w:r>
+        <w:rPr>
+          <w:lang w:val="es-ES_tradnl"/>
+        </w:rPr>
+        <w:t>823</w:t>
+      </w:r>
+      <w:r>
+        <w:t xml:space="preserve"> </w:t>
+      </w:r>
+      <w:r>
+        <w:t>hm³</w:t>
+      </w:r>
+      <w:r>
+        <w:t xml:space="preserve"> y se llena con bombeo; el modelo no puede explicarlo con la lluvia.</w:t>
+      </w:r>
+    </w:p>
+    <w:p>
+      <w:pPr>
+        <w:rPr>
+          <w:lang w:val="es-ES_tradnl"/>
+        </w:rPr>
+      </w:pPr>
+    </w:p>
+    <w:p>
+      <w:pPr>
+        <w:rPr>
+          <w:color w:val="00B050"/>
+          <w:lang w:val="es-ES_tradnl"/>
+        </w:rPr>
+      </w:pPr>
+      <w:r>
+        <w:rPr>
+          <w:color w:val="00B050"/>
+          <w:lang w:val="es-ES_tradnl"/>
+        </w:rPr>
+        <w:t>Datos guardados (Parquet):</w:t>
+      </w:r>
+    </w:p>
+    <w:p>
+      <w:pPr>
+        <w:pStyle w:val="Prrafodelista"/>
+        <w:numPr>
+          <w:ilvl w:val="0"/>
+          <w:numId w:val="2"/>
+        </w:numPr>
+        <w:rPr>
+          <w:lang w:val="es-ES_tradnl"/>
+        </w:rPr>
+      </w:pPr>
+      <w:proofErr w:type="spellStart"/>
+      <w:r>
+        <w:rPr>
+          <w:i/>
+          <w:iCs/>
+          <w:color w:val="0070C0"/>
+          <w:lang w:val="es-ES_tradnl"/>
+        </w:rPr>
+        <w:t>Embalses_</w:t>
+      </w:r>
+      <w:proofErr w:type="gramStart"/>
+      <w:r>
+        <w:rPr>
+          <w:i/>
+          <w:iCs/>
+          <w:color w:val="0070C0"/>
+          <w:lang w:val="es-ES_tradnl"/>
+        </w:rPr>
+        <w:t>guadalquivir.parquet</w:t>
+      </w:r>
+      <w:proofErr w:type="spellEnd"/>
+      <w:proofErr w:type="gramEnd"/>
+      <w:r>
+        <w:rPr>
+          <w:i/>
+          <w:iCs/>
+          <w:color w:val="0070C0"/>
+          <w:lang w:val="es-ES_tradnl"/>
+        </w:rPr>
+        <w:t>:</w:t>
+      </w:r>
+      <w:r>
+        <w:rPr>
+          <w:color w:val="0070C0"/>
+          <w:lang w:val="es-ES_tradnl"/>
+        </w:rPr>
+        <w:t xml:space="preserve"> </w:t>
+      </w:r>
+      <w:r>
+        <w:rPr>
+          <w:lang w:val="es-ES_tradnl"/>
+        </w:rPr>
+        <w:t>datos limpios por embalse.</w:t>
+      </w:r>
+    </w:p>
+    <w:p>
+      <w:pPr>
+        <w:pStyle w:val="Prrafodelista"/>
+        <w:numPr>
+          <w:ilvl w:val="0"/>
+          <w:numId w:val="2"/>
+        </w:numPr>
+        <w:rPr>
+          <w:lang w:val="es-ES_tradnl"/>
+        </w:rPr>
+      </w:pPr>
+      <w:proofErr w:type="spellStart"/>
+      <w:r>
+        <w:rPr>
+          <w:i/>
+          <w:iCs/>
+          <w:color w:val="0070C0"/>
+          <w:lang w:val="es-ES_tradnl"/>
+        </w:rPr>
+        <w:t>Cuenca_</w:t>
+      </w:r>
+      <w:proofErr w:type="gramStart"/>
+      <w:r>
+        <w:rPr>
+          <w:i/>
+          <w:iCs/>
+          <w:color w:val="0070C0"/>
+          <w:lang w:val="es-ES_tradnl"/>
+        </w:rPr>
+        <w:t>semanal.parquet</w:t>
+      </w:r>
+      <w:proofErr w:type="spellEnd"/>
+      <w:proofErr w:type="gramEnd"/>
+      <w:r>
+        <w:rPr>
+          <w:color w:val="0070C0"/>
+          <w:lang w:val="es-ES_tradnl"/>
+        </w:rPr>
+        <w:t xml:space="preserve">: </w:t>
+      </w:r>
+      <w:r>
+        <w:rPr>
+          <w:lang w:val="es-ES_tradnl"/>
+        </w:rPr>
+        <w:t>serie semanal de la cuenca: volumen, capacidad y % de llenado.</w:t>
+      </w:r>
+    </w:p>
+    <w:p>
+      <w:pPr>
+        <w:rPr>
+          <w:lang w:val="es-ES_tradnl"/>
+        </w:rPr>
+      </w:pPr>
+    </w:p>
+    <w:p>
+      <w:pPr>
+        <w:rPr>
+          <w:lang w:val="es-ES_tradnl"/>
+        </w:rPr>
+      </w:pPr>
+    </w:p>
+    <w:p>
+      <w:pPr>
+        <w:rPr>
+          <w:lang w:val="es-ES_tradnl"/>
+        </w:rPr>
+      </w:pPr>
+    </w:p>
+    <w:p>
+      <w:pPr>
+        <w:rPr>
+          <w:lang w:val="es-ES_tradnl"/>
+        </w:rPr>
+      </w:pPr>
+    </w:p>
+    <w:p>
+      <w:pPr>
+        <w:rPr>
+          <w:lang w:val="es-ES_tradnl"/>
+        </w:rPr>
+      </w:pPr>
+    </w:p>
+    <w:p>
+      <w:pPr>
+        <w:rPr>
+          <w:lang w:val="es-ES_tradnl"/>
+        </w:rPr>
+      </w:pPr>
+    </w:p>
+    <w:p>
+      <w:pPr>
+        <w:rPr>
+          <w:lang w:val="es-ES_tradnl"/>
+        </w:rPr>
+      </w:pPr>
+    </w:p>
+    <w:p>
+      <w:pPr>
+        <w:rPr>
+          <w:lang w:val="es-ES_tradnl"/>
+        </w:rPr>
+      </w:pPr>
+    </w:p>
+    <w:p>
+      <w:pPr>
+        <w:rPr>
+          <w:lang w:val="es-ES_tradnl"/>
+        </w:rPr>
+      </w:pPr>
+    </w:p>
+    <w:p>
+      <w:pPr>
+        <w:rPr>
+          <w:lang w:val="es-ES_tradnl"/>
+        </w:rPr>
+      </w:pPr>
+    </w:p>
+    <w:p>
+      <w:pPr>
+        <w:rPr>
+          <w:lang w:val="es-ES_tradnl"/>
+        </w:rPr>
+      </w:pPr>
+    </w:p>
+    <w:p>
+      <w:pPr>
+        <w:rPr>
+          <w:lang w:val="es-ES_tradnl"/>
+        </w:rPr>
+      </w:pPr>
+    </w:p>
+    <w:p>
+      <w:pPr>
+        <w:rPr>
+          <w:lang w:val="es-ES_tradnl"/>
+        </w:rPr>
+      </w:pPr>
+    </w:p>
+    <w:p>
+      <w:pPr>
+        <w:rPr>
+          <w:lang w:val="es-ES_tradnl"/>
+        </w:rPr>
+      </w:pPr>
+    </w:p>
+    <w:p>
+      <w:pPr>
+        <w:rPr>
+          <w:lang w:val="es-ES_tradnl"/>
+        </w:rPr>
+      </w:pPr>
+    </w:p>
+    <w:p>
+      <w:pPr>
+        <w:rPr>
+          <w:lang w:val="es-ES_tradnl"/>
+        </w:rPr>
+      </w:pPr>
+    </w:p>
+    <w:p>
+      <w:pPr>
+        <w:rPr>
+          <w:lang w:val="es-ES_tradnl"/>
+        </w:rPr>
+      </w:pPr>
+    </w:p>
+    <w:p>
+      <w:pPr>
+        <w:rPr>
+          <w:lang w:val="es-ES_tradnl"/>
+        </w:rPr>
+      </w:pPr>
+    </w:p>
+    <w:p>
+      <w:pPr>
+        <w:rPr>
+          <w:lang w:val="es-ES_tradnl"/>
+        </w:rPr>
+      </w:pPr>
+    </w:p>
+    <w:p>
+      <w:pPr>
+        <w:rPr>
+          <w:lang w:val="es-ES_tradnl"/>
+        </w:rPr>
+      </w:pPr>
+    </w:p>
+    <w:p>
+      <w:pPr>
+        <w:rPr>
+          <w:lang w:val="es-ES_tradnl"/>
+        </w:rPr>
+      </w:pPr>
+    </w:p>
+    <w:p>
+      <w:pPr>
+        <w:rPr>
+          <w:lang w:val="es-ES_tradnl"/>
+        </w:rPr>
+      </w:pPr>
+    </w:p>
+    <w:p>
+      <w:pPr>
+        <w:rPr>
+          <w:lang w:val="es-ES_tradnl"/>
+        </w:rPr>
+      </w:pPr>
+    </w:p>
+    <w:p>
+      <w:pPr>
+        <w:rPr>
+          <w:lang w:val="es-ES_tradnl"/>
+        </w:rPr>
+      </w:pPr>
+    </w:p>
+    <w:p>
+      <w:pPr>
+        <w:rPr>
+          <w:lang w:val="es-ES_tradnl"/>
+        </w:rPr>
+      </w:pPr>
+    </w:p>
+    <w:p>
+      <w:pPr>
+        <w:rPr>
+          <w:lang w:val="es-ES_tradnl"/>
+        </w:rPr>
+      </w:pPr>
+    </w:p>
+    <w:p>
+      <w:pPr>
+        <w:rPr>
+          <w:lang w:val="es-ES_tradnl"/>
+        </w:rPr>
+      </w:pPr>
+    </w:p>
+    <w:p>
+      <w:pPr>
+        <w:rPr>
+          <w:lang w:val="es-ES_tradnl"/>
+        </w:rPr>
+      </w:pPr>
+    </w:p>
+    <w:p>
+      <w:pPr>
+        <w:rPr>
+          <w:lang w:val="es-ES_tradnl"/>
+        </w:rPr>
+      </w:pPr>
+    </w:p>
+    <w:p>
+      <w:pPr>
+        <w:rPr>
+          <w:lang w:val="es-ES_tradnl"/>
+        </w:rPr>
+      </w:pPr>
+    </w:p>
+    <w:p>
+      <w:pPr>
+        <w:rPr>
+          <w:color w:val="EE0000"/>
+          <w:lang w:val="es-ES_tradnl"/>
+        </w:rPr>
+      </w:pPr>
+      <w:r>
+        <w:rPr>
+          <w:color w:val="EE0000"/>
+          <w:lang w:val="es-ES_tradnl"/>
+        </w:rPr>
         <w:t>Conceptos nuevos/repaso:</w:t>
       </w:r>
     </w:p>
     <w:p>
       <w:pPr>
-        <w:rPr>
-          <w:lang w:val="es-ES_tradnl"/>
-        </w:rPr>
-      </w:pPr>
+        <w:pStyle w:val="Prrafodelista"/>
+        <w:numPr>
+          <w:ilvl w:val="0"/>
+          <w:numId w:val="2"/>
+        </w:numPr>
+        <w:rPr>
+          <w:lang w:val="es-ES_tradnl"/>
+        </w:rPr>
+      </w:pPr>
+      <w:r>
+        <w:rPr>
+          <w:b/>
+          <w:bCs/>
+          <w:lang w:val="es-ES_tradnl"/>
+        </w:rPr>
+        <w:t>Parquet:</w:t>
+      </w:r>
+      <w:r>
+        <w:rPr>
+          <w:lang w:val="es-ES_tradnl"/>
+        </w:rPr>
+        <w:t xml:space="preserve"> formato de tabla comprimido que guarda los tipos de cada columna. Es el estándar para datos procesados.</w:t>
+      </w:r>
     </w:p>
     <w:sectPr>
       <w:pgSz w:w="11906" w:h="16838"/>

</xml_diff>

<commit_message>
Ingesta de datos diarios de AEMET
</commit_message>
<xml_diff>
--- a/docs/Proyecto Observatorio Sequia Guadalquivir.docx
+++ b/docs/Proyecto Observatorio Sequia Guadalquivir.docx
@@ -1014,13 +1014,6 @@
     <w:p>
       <w:pPr>
         <w:rPr>
-          <w:lang w:val="es-ES_tradnl"/>
-        </w:rPr>
-      </w:pPr>
-    </w:p>
-    <w:p>
-      <w:pPr>
-        <w:rPr>
           <w:color w:val="00B050"/>
           <w:lang w:val="es-ES_tradnl"/>
         </w:rPr>
@@ -1135,6 +1128,527 @@
         </w:rPr>
         <w:t>serie semanal de la cuenca: volumen, capacidad y % de llenado.</w:t>
       </w:r>
+    </w:p>
+    <w:p>
+      <w:pPr>
+        <w:rPr>
+          <w:lang w:val="es-ES_tradnl"/>
+        </w:rPr>
+      </w:pPr>
+    </w:p>
+    <w:p>
+      <w:pPr>
+        <w:rPr>
+          <w:color w:val="EE0000"/>
+          <w:lang w:val="es-ES_tradnl"/>
+        </w:rPr>
+      </w:pPr>
+      <w:r>
+        <w:rPr>
+          <w:color w:val="EE0000"/>
+          <w:lang w:val="es-ES_tradnl"/>
+        </w:rPr>
+        <w:t>6. Ingesta de datos de AEMET</w:t>
+      </w:r>
+    </w:p>
+    <w:p>
+      <w:pPr>
+        <w:pStyle w:val="Prrafodelista"/>
+        <w:numPr>
+          <w:ilvl w:val="0"/>
+          <w:numId w:val="2"/>
+        </w:numPr>
+        <w:rPr>
+          <w:lang w:val="es-ES_tradnl"/>
+        </w:rPr>
+      </w:pPr>
+      <w:r>
+        <w:rPr>
+          <w:b/>
+          <w:bCs/>
+          <w:lang w:val="es-ES_tradnl"/>
+        </w:rPr>
+        <w:t>Qué es:</w:t>
+      </w:r>
+      <w:r>
+        <w:rPr>
+          <w:lang w:val="es-ES_tradnl"/>
+        </w:rPr>
+        <w:t xml:space="preserve"> descargar la lluvia y temperatura diaria de estaciones de la cuenca desde 1994 hasta hoy, usando la API de AEMET </w:t>
+      </w:r>
+      <w:proofErr w:type="spellStart"/>
+      <w:r>
+        <w:rPr>
+          <w:lang w:val="es-ES_tradnl"/>
+        </w:rPr>
+        <w:t>OpenData</w:t>
+      </w:r>
+      <w:proofErr w:type="spellEnd"/>
+      <w:r>
+        <w:rPr>
+          <w:lang w:val="es-ES_tradnl"/>
+        </w:rPr>
+        <w:t>.</w:t>
+      </w:r>
+    </w:p>
+    <w:p>
+      <w:pPr>
+        <w:pStyle w:val="Prrafodelista"/>
+        <w:numPr>
+          <w:ilvl w:val="0"/>
+          <w:numId w:val="2"/>
+        </w:numPr>
+        <w:rPr>
+          <w:lang w:val="es-ES_tradnl"/>
+        </w:rPr>
+      </w:pPr>
+      <w:r>
+        <w:rPr>
+          <w:b/>
+          <w:bCs/>
+          <w:lang w:val="es-ES_tradnl"/>
+        </w:rPr>
+        <w:t>Para qué:</w:t>
+      </w:r>
+      <w:r>
+        <w:rPr>
+          <w:lang w:val="es-ES_tradnl"/>
+        </w:rPr>
+        <w:t xml:space="preserve"> el volumen del embalse cambia por lluvia que entra (ríos) y el agua que sale (riego, evaporación). Sin clima, el modelo no sabe qué agua viene en camino.</w:t>
+      </w:r>
+    </w:p>
+    <w:p>
+      <w:pPr>
+        <w:rPr>
+          <w:color w:val="00B050"/>
+          <w:lang w:val="es-ES_tradnl"/>
+        </w:rPr>
+      </w:pPr>
+      <w:r>
+        <w:rPr>
+          <w:color w:val="00B050"/>
+          <w:lang w:val="es-ES_tradnl"/>
+        </w:rPr>
+        <w:t xml:space="preserve">Cómo funciona la API: </w:t>
+      </w:r>
+    </w:p>
+    <w:p>
+      <w:pPr>
+        <w:pStyle w:val="Prrafodelista"/>
+        <w:numPr>
+          <w:ilvl w:val="0"/>
+          <w:numId w:val="2"/>
+        </w:numPr>
+        <w:rPr>
+          <w:lang w:val="es-ES_tradnl"/>
+        </w:rPr>
+      </w:pPr>
+      <w:r>
+        <w:rPr>
+          <w:lang w:val="es-ES_tradnl"/>
+        </w:rPr>
+        <w:t xml:space="preserve">API </w:t>
+      </w:r>
+      <w:proofErr w:type="spellStart"/>
+      <w:r>
+        <w:rPr>
+          <w:lang w:val="es-ES_tradnl"/>
+        </w:rPr>
+        <w:t>key</w:t>
+      </w:r>
+      <w:proofErr w:type="spellEnd"/>
+      <w:r>
+        <w:rPr>
+          <w:lang w:val="es-ES_tradnl"/>
+        </w:rPr>
+        <w:t xml:space="preserve"> gratuita guardada </w:t>
+      </w:r>
+      <w:proofErr w:type="gramStart"/>
+      <w:r>
+        <w:rPr>
+          <w:lang w:val="es-ES_tradnl"/>
+        </w:rPr>
+        <w:t>en .</w:t>
+      </w:r>
+      <w:proofErr w:type="spellStart"/>
+      <w:r>
+        <w:rPr>
+          <w:lang w:val="es-ES_tradnl"/>
+        </w:rPr>
+        <w:t>env</w:t>
+      </w:r>
+      <w:proofErr w:type="spellEnd"/>
+      <w:proofErr w:type="gramEnd"/>
+    </w:p>
+    <w:p>
+      <w:pPr>
+        <w:pStyle w:val="Prrafodelista"/>
+        <w:numPr>
+          <w:ilvl w:val="0"/>
+          <w:numId w:val="2"/>
+        </w:numPr>
+        <w:rPr>
+          <w:lang w:val="es-ES_tradnl"/>
+        </w:rPr>
+      </w:pPr>
+      <w:r>
+        <w:rPr>
+          <w:color w:val="0070C0"/>
+          <w:lang w:val="es-ES_tradnl"/>
+        </w:rPr>
+        <w:t xml:space="preserve">Dos pasos: </w:t>
+      </w:r>
+      <w:r>
+        <w:rPr>
+          <w:lang w:val="es-ES_tradnl"/>
+        </w:rPr>
+        <w:t>la petición devuelve una URL y en esa URL están los datos.</w:t>
+      </w:r>
+    </w:p>
+    <w:p>
+      <w:pPr>
+        <w:pStyle w:val="Prrafodelista"/>
+        <w:numPr>
+          <w:ilvl w:val="0"/>
+          <w:numId w:val="2"/>
+        </w:numPr>
+        <w:rPr>
+          <w:lang w:val="es-ES_tradnl"/>
+        </w:rPr>
+      </w:pPr>
+      <w:r>
+        <w:rPr>
+          <w:color w:val="0070C0"/>
+          <w:lang w:val="es-ES_tradnl"/>
+        </w:rPr>
+        <w:t xml:space="preserve">Limites: </w:t>
+      </w:r>
+      <w:r>
+        <w:rPr>
+          <w:lang w:val="es-ES_tradnl"/>
+        </w:rPr>
+        <w:t xml:space="preserve">máximo 6 meses por petición y un </w:t>
+      </w:r>
+      <w:proofErr w:type="spellStart"/>
+      <w:r>
+        <w:rPr>
+          <w:lang w:val="es-ES_tradnl"/>
+        </w:rPr>
+        <w:t>numero</w:t>
+      </w:r>
+      <w:proofErr w:type="spellEnd"/>
+      <w:r>
+        <w:rPr>
+          <w:lang w:val="es-ES_tradnl"/>
+        </w:rPr>
+        <w:t xml:space="preserve"> de peticiones por minuto limitado (error 429) </w:t>
+      </w:r>
+      <w:r>
+        <w:rPr>
+          <w:lang w:val="es-ES_tradnl"/>
+        </w:rPr>
+        <w:sym w:font="Wingdings" w:char="F0E0"/>
+      </w:r>
+      <w:r>
+        <w:rPr>
+          <w:lang w:val="es-ES_tradnl"/>
+        </w:rPr>
+        <w:t xml:space="preserve"> descarga por tramos de 6 meses con pausas.</w:t>
+      </w:r>
+    </w:p>
+    <w:p>
+      <w:pPr>
+        <w:rPr>
+          <w:lang w:val="es-ES_tradnl"/>
+        </w:rPr>
+      </w:pPr>
+    </w:p>
+    <w:p>
+      <w:pPr>
+        <w:rPr>
+          <w:color w:val="00B050"/>
+          <w:lang w:val="es-ES_tradnl"/>
+        </w:rPr>
+      </w:pPr>
+      <w:r>
+        <w:rPr>
+          <w:color w:val="00B050"/>
+          <w:lang w:val="es-ES_tradnl"/>
+        </w:rPr>
+        <w:lastRenderedPageBreak/>
+        <w:t>Decisiones:</w:t>
+      </w:r>
+    </w:p>
+    <w:p>
+      <w:pPr>
+        <w:pStyle w:val="Prrafodelista"/>
+        <w:numPr>
+          <w:ilvl w:val="0"/>
+          <w:numId w:val="2"/>
+        </w:numPr>
+        <w:rPr>
+          <w:lang w:val="es-ES_tradnl"/>
+        </w:rPr>
+      </w:pPr>
+      <w:r>
+        <w:rPr>
+          <w:color w:val="0070C0"/>
+          <w:lang w:val="es-ES_tradnl"/>
+        </w:rPr>
+        <w:t xml:space="preserve">Comprobar la disponibilidad antes de descargar: </w:t>
+      </w:r>
+      <w:r>
+        <w:rPr>
+          <w:lang w:val="es-ES_tradnl"/>
+        </w:rPr>
+        <w:t>muestra de 1994 y de 2026 en las 81 estaciones de la cuenca.</w:t>
+      </w:r>
+    </w:p>
+    <w:p>
+      <w:pPr>
+        <w:pStyle w:val="Prrafodelista"/>
+        <w:numPr>
+          <w:ilvl w:val="0"/>
+          <w:numId w:val="2"/>
+        </w:numPr>
+        <w:rPr>
+          <w:lang w:val="es-ES_tradnl"/>
+        </w:rPr>
+      </w:pPr>
+      <w:r>
+        <w:rPr>
+          <w:color w:val="0070C0"/>
+          <w:lang w:val="es-ES_tradnl"/>
+        </w:rPr>
+        <w:t xml:space="preserve">7 estaciones con datos completos: </w:t>
+      </w:r>
+      <w:r>
+        <w:rPr>
+          <w:lang w:val="es-ES_tradnl"/>
+        </w:rPr>
+        <w:t xml:space="preserve">Jaén, Córdoba Aeropuerto, Granada Base Aérea, Granada Aeropuerto, Sevilla Aeropuerto, Morón y </w:t>
+      </w:r>
+      <w:proofErr w:type="spellStart"/>
+      <w:r>
+        <w:rPr>
+          <w:lang w:val="es-ES_tradnl"/>
+        </w:rPr>
+        <w:t>Villa</w:t>
+      </w:r>
+      <w:r>
+        <w:rPr>
+          <w:lang w:val="es-ES_tradnl"/>
+        </w:rPr>
+        <w:t>r</w:t>
+      </w:r>
+      <w:r>
+        <w:rPr>
+          <w:lang w:val="es-ES_tradnl"/>
+        </w:rPr>
+        <w:t>rodrigo</w:t>
+      </w:r>
+      <w:proofErr w:type="spellEnd"/>
+      <w:r>
+        <w:rPr>
+          <w:lang w:val="es-ES_tradnl"/>
+        </w:rPr>
+        <w:t xml:space="preserve">. Huelva queda fuera por estar en la costa y fuera de la cuenca. </w:t>
+      </w:r>
+    </w:p>
+    <w:p>
+      <w:pPr>
+        <w:pStyle w:val="Prrafodelista"/>
+        <w:numPr>
+          <w:ilvl w:val="0"/>
+          <w:numId w:val="2"/>
+        </w:numPr>
+        <w:rPr>
+          <w:lang w:val="es-ES_tradnl"/>
+        </w:rPr>
+      </w:pPr>
+      <w:r>
+        <w:rPr>
+          <w:color w:val="0070C0"/>
+          <w:lang w:val="es-ES_tradnl"/>
+        </w:rPr>
+        <w:t xml:space="preserve">Limitación: </w:t>
+      </w:r>
+      <w:r>
+        <w:rPr>
+          <w:lang w:val="es-ES_tradnl"/>
+        </w:rPr>
+        <w:t>las estaciones de montaña son recientes. Usamos estaciones de valle, cuya lluvia sube y baja a la vez que la de la sierra.</w:t>
+      </w:r>
+    </w:p>
+    <w:p>
+      <w:pPr>
+        <w:pStyle w:val="Prrafodelista"/>
+        <w:numPr>
+          <w:ilvl w:val="0"/>
+          <w:numId w:val="2"/>
+        </w:numPr>
+        <w:rPr>
+          <w:lang w:val="es-ES_tradnl"/>
+        </w:rPr>
+      </w:pPr>
+      <w:r>
+        <w:rPr>
+          <w:lang w:val="es-ES_tradnl"/>
+        </w:rPr>
+        <w:t>Lluvia de la cuenca = media de las 7 estaciones.</w:t>
+      </w:r>
+    </w:p>
+    <w:p>
+      <w:pPr>
+        <w:rPr>
+          <w:color w:val="00B050"/>
+          <w:lang w:val="es-ES_tradnl"/>
+        </w:rPr>
+      </w:pPr>
+      <w:r>
+        <w:rPr>
+          <w:color w:val="00B050"/>
+          <w:lang w:val="es-ES_tradnl"/>
+        </w:rPr>
+        <w:t xml:space="preserve">Robustez: </w:t>
+      </w:r>
+    </w:p>
+    <w:p>
+      <w:pPr>
+        <w:pStyle w:val="Prrafodelista"/>
+        <w:numPr>
+          <w:ilvl w:val="0"/>
+          <w:numId w:val="2"/>
+        </w:numPr>
+        <w:rPr>
+          <w:lang w:val="es-ES_tradnl"/>
+        </w:rPr>
+      </w:pPr>
+      <w:r>
+        <w:rPr>
+          <w:color w:val="0070C0"/>
+          <w:lang w:val="es-ES_tradnl"/>
+        </w:rPr>
+        <w:t>Try/</w:t>
+      </w:r>
+      <w:proofErr w:type="spellStart"/>
+      <w:r>
+        <w:rPr>
+          <w:color w:val="0070C0"/>
+          <w:lang w:val="es-ES_tradnl"/>
+        </w:rPr>
+        <w:t>except</w:t>
+      </w:r>
+      <w:proofErr w:type="spellEnd"/>
+      <w:r>
+        <w:rPr>
+          <w:color w:val="0070C0"/>
+          <w:lang w:val="es-ES_tradnl"/>
+        </w:rPr>
+        <w:t xml:space="preserve">: </w:t>
+      </w:r>
+      <w:r>
+        <w:rPr>
+          <w:lang w:val="es-ES_tradnl"/>
+        </w:rPr>
+        <w:t>con reintentos ante respuestas vacías o errores del servidor.</w:t>
+      </w:r>
+    </w:p>
+    <w:p>
+      <w:pPr>
+        <w:pStyle w:val="Prrafodelista"/>
+        <w:numPr>
+          <w:ilvl w:val="0"/>
+          <w:numId w:val="2"/>
+        </w:numPr>
+        <w:rPr>
+          <w:lang w:val="es-ES_tradnl"/>
+        </w:rPr>
+      </w:pPr>
+      <w:r>
+        <w:rPr>
+          <w:lang w:val="es-ES_tradnl"/>
+        </w:rPr>
+        <w:t xml:space="preserve">Un CSV por estación en </w:t>
+      </w:r>
+      <w:r>
+        <w:rPr>
+          <w:i/>
+          <w:iCs/>
+          <w:lang w:val="es-ES_tradnl"/>
+        </w:rPr>
+        <w:t>data/raw/</w:t>
+      </w:r>
+      <w:proofErr w:type="spellStart"/>
+      <w:r>
+        <w:rPr>
+          <w:i/>
+          <w:iCs/>
+          <w:lang w:val="es-ES_tradnl"/>
+        </w:rPr>
+        <w:t>aemet</w:t>
+      </w:r>
+      <w:proofErr w:type="spellEnd"/>
+      <w:r>
+        <w:rPr>
+          <w:lang w:val="es-ES_tradnl"/>
+        </w:rPr>
+        <w:t>. Si falla, se reanuda sin repetir lo descargado.</w:t>
+      </w:r>
+    </w:p>
+    <w:p>
+      <w:pPr>
+        <w:rPr>
+          <w:color w:val="00B050"/>
+          <w:lang w:val="es-ES_tradnl"/>
+        </w:rPr>
+      </w:pPr>
+      <w:r>
+        <w:rPr>
+          <w:color w:val="00B050"/>
+          <w:lang w:val="es-ES_tradnl"/>
+        </w:rPr>
+        <w:t>En producción (futuro):</w:t>
+      </w:r>
+    </w:p>
+    <w:p>
+      <w:pPr>
+        <w:pStyle w:val="Prrafodelista"/>
+        <w:numPr>
+          <w:ilvl w:val="0"/>
+          <w:numId w:val="2"/>
+        </w:numPr>
+        <w:rPr>
+          <w:lang w:val="es-ES_tradnl"/>
+        </w:rPr>
+      </w:pPr>
+      <w:r>
+        <w:rPr>
+          <w:color w:val="0070C0"/>
+          <w:lang w:val="es-ES_tradnl"/>
+        </w:rPr>
+        <w:t xml:space="preserve">Carga incremental por semana: </w:t>
+      </w:r>
+      <w:r>
+        <w:rPr>
+          <w:lang w:val="es-ES_tradnl"/>
+        </w:rPr>
+        <w:t>pedir solo los días nuevos desde la última fecha guardada, lanzada por un programador de tareas.</w:t>
+      </w:r>
+    </w:p>
+    <w:p>
+      <w:pPr>
+        <w:rPr>
+          <w:lang w:val="es-ES_tradnl"/>
+        </w:rPr>
+      </w:pPr>
+    </w:p>
+    <w:p>
+      <w:pPr>
+        <w:rPr>
+          <w:lang w:val="es-ES_tradnl"/>
+        </w:rPr>
+      </w:pPr>
     </w:p>
     <w:p>
       <w:pPr>

</xml_diff>

<commit_message>
Integración de datos y EDA
</commit_message>
<xml_diff>
--- a/docs/Proyecto Observatorio Sequia Guadalquivir.docx
+++ b/docs/Proyecto Observatorio Sequia Guadalquivir.docx
@@ -1646,223 +1646,6 @@
     <w:p>
       <w:pPr>
         <w:rPr>
-          <w:lang w:val="es-ES_tradnl"/>
-        </w:rPr>
-      </w:pPr>
-    </w:p>
-    <w:p>
-      <w:pPr>
-        <w:rPr>
-          <w:lang w:val="es-ES_tradnl"/>
-        </w:rPr>
-      </w:pPr>
-    </w:p>
-    <w:p>
-      <w:pPr>
-        <w:rPr>
-          <w:lang w:val="es-ES_tradnl"/>
-        </w:rPr>
-      </w:pPr>
-    </w:p>
-    <w:p>
-      <w:pPr>
-        <w:rPr>
-          <w:lang w:val="es-ES_tradnl"/>
-        </w:rPr>
-      </w:pPr>
-    </w:p>
-    <w:p>
-      <w:pPr>
-        <w:rPr>
-          <w:lang w:val="es-ES_tradnl"/>
-        </w:rPr>
-      </w:pPr>
-    </w:p>
-    <w:p>
-      <w:pPr>
-        <w:rPr>
-          <w:lang w:val="es-ES_tradnl"/>
-        </w:rPr>
-      </w:pPr>
-    </w:p>
-    <w:p>
-      <w:pPr>
-        <w:rPr>
-          <w:lang w:val="es-ES_tradnl"/>
-        </w:rPr>
-      </w:pPr>
-    </w:p>
-    <w:p>
-      <w:pPr>
-        <w:rPr>
-          <w:lang w:val="es-ES_tradnl"/>
-        </w:rPr>
-      </w:pPr>
-    </w:p>
-    <w:p>
-      <w:pPr>
-        <w:rPr>
-          <w:lang w:val="es-ES_tradnl"/>
-        </w:rPr>
-      </w:pPr>
-    </w:p>
-    <w:p>
-      <w:pPr>
-        <w:rPr>
-          <w:lang w:val="es-ES_tradnl"/>
-        </w:rPr>
-      </w:pPr>
-    </w:p>
-    <w:p>
-      <w:pPr>
-        <w:rPr>
-          <w:lang w:val="es-ES_tradnl"/>
-        </w:rPr>
-      </w:pPr>
-    </w:p>
-    <w:p>
-      <w:pPr>
-        <w:rPr>
-          <w:lang w:val="es-ES_tradnl"/>
-        </w:rPr>
-      </w:pPr>
-    </w:p>
-    <w:p>
-      <w:pPr>
-        <w:rPr>
-          <w:lang w:val="es-ES_tradnl"/>
-        </w:rPr>
-      </w:pPr>
-    </w:p>
-    <w:p>
-      <w:pPr>
-        <w:rPr>
-          <w:lang w:val="es-ES_tradnl"/>
-        </w:rPr>
-      </w:pPr>
-    </w:p>
-    <w:p>
-      <w:pPr>
-        <w:rPr>
-          <w:lang w:val="es-ES_tradnl"/>
-        </w:rPr>
-      </w:pPr>
-    </w:p>
-    <w:p>
-      <w:pPr>
-        <w:rPr>
-          <w:lang w:val="es-ES_tradnl"/>
-        </w:rPr>
-      </w:pPr>
-    </w:p>
-    <w:p>
-      <w:pPr>
-        <w:rPr>
-          <w:lang w:val="es-ES_tradnl"/>
-        </w:rPr>
-      </w:pPr>
-    </w:p>
-    <w:p>
-      <w:pPr>
-        <w:rPr>
-          <w:lang w:val="es-ES_tradnl"/>
-        </w:rPr>
-      </w:pPr>
-    </w:p>
-    <w:p>
-      <w:pPr>
-        <w:rPr>
-          <w:lang w:val="es-ES_tradnl"/>
-        </w:rPr>
-      </w:pPr>
-    </w:p>
-    <w:p>
-      <w:pPr>
-        <w:rPr>
-          <w:lang w:val="es-ES_tradnl"/>
-        </w:rPr>
-      </w:pPr>
-    </w:p>
-    <w:p>
-      <w:pPr>
-        <w:rPr>
-          <w:lang w:val="es-ES_tradnl"/>
-        </w:rPr>
-      </w:pPr>
-    </w:p>
-    <w:p>
-      <w:pPr>
-        <w:rPr>
-          <w:lang w:val="es-ES_tradnl"/>
-        </w:rPr>
-      </w:pPr>
-    </w:p>
-    <w:p>
-      <w:pPr>
-        <w:rPr>
-          <w:lang w:val="es-ES_tradnl"/>
-        </w:rPr>
-      </w:pPr>
-    </w:p>
-    <w:p>
-      <w:pPr>
-        <w:rPr>
-          <w:lang w:val="es-ES_tradnl"/>
-        </w:rPr>
-      </w:pPr>
-    </w:p>
-    <w:p>
-      <w:pPr>
-        <w:rPr>
-          <w:lang w:val="es-ES_tradnl"/>
-        </w:rPr>
-      </w:pPr>
-    </w:p>
-    <w:p>
-      <w:pPr>
-        <w:rPr>
-          <w:lang w:val="es-ES_tradnl"/>
-        </w:rPr>
-      </w:pPr>
-    </w:p>
-    <w:p>
-      <w:pPr>
-        <w:rPr>
-          <w:lang w:val="es-ES_tradnl"/>
-        </w:rPr>
-      </w:pPr>
-    </w:p>
-    <w:p>
-      <w:pPr>
-        <w:rPr>
-          <w:lang w:val="es-ES_tradnl"/>
-        </w:rPr>
-      </w:pPr>
-    </w:p>
-    <w:p>
-      <w:pPr>
-        <w:rPr>
-          <w:lang w:val="es-ES_tradnl"/>
-        </w:rPr>
-      </w:pPr>
-    </w:p>
-    <w:p>
-      <w:pPr>
-        <w:rPr>
-          <w:lang w:val="es-ES_tradnl"/>
-        </w:rPr>
-      </w:pPr>
-    </w:p>
-    <w:p>
-      <w:pPr>
-        <w:rPr>
-          <w:lang w:val="es-ES_tradnl"/>
-        </w:rPr>
-      </w:pPr>
-    </w:p>
-    <w:p>
-      <w:pPr>
-        <w:rPr>
           <w:color w:val="EE0000"/>
           <w:lang w:val="es-ES_tradnl"/>
         </w:rPr>
@@ -1872,7 +1655,7 @@
           <w:color w:val="EE0000"/>
           <w:lang w:val="es-ES_tradnl"/>
         </w:rPr>
-        <w:t>Conceptos nuevos/repaso:</w:t>
+        <w:t>7. Limpieza de datos de AEMET</w:t>
       </w:r>
     </w:p>
     <w:p>
@@ -1892,6 +1675,669 @@
           <w:bCs/>
           <w:lang w:val="es-ES_tradnl"/>
         </w:rPr>
+        <w:t>Qué es:</w:t>
+      </w:r>
+      <w:r>
+        <w:rPr>
+          <w:lang w:val="es-ES_tradnl"/>
+        </w:rPr>
+        <w:t xml:space="preserve"> dejar la lluvia y la temperatura en una serie semanal de la cuenca, con el mismo calendario que los embalses. </w:t>
+      </w:r>
+    </w:p>
+    <w:p>
+      <w:pPr>
+        <w:rPr>
+          <w:color w:val="00B050"/>
+          <w:lang w:val="es-ES_tradnl"/>
+        </w:rPr>
+      </w:pPr>
+      <w:r>
+        <w:rPr>
+          <w:color w:val="00B050"/>
+          <w:lang w:val="es-ES_tradnl"/>
+        </w:rPr>
+        <w:t xml:space="preserve">Decisiones: </w:t>
+      </w:r>
+    </w:p>
+    <w:p>
+      <w:pPr>
+        <w:pStyle w:val="Prrafodelista"/>
+        <w:numPr>
+          <w:ilvl w:val="0"/>
+          <w:numId w:val="2"/>
+        </w:numPr>
+        <w:rPr>
+          <w:lang w:val="es-ES_tradnl"/>
+        </w:rPr>
+      </w:pPr>
+      <w:r>
+        <w:rPr>
+          <w:color w:val="0070C0"/>
+          <w:lang w:val="es-ES_tradnl"/>
+        </w:rPr>
+        <w:t xml:space="preserve">Quitar </w:t>
+      </w:r>
+      <w:proofErr w:type="spellStart"/>
+      <w:r>
+        <w:rPr>
+          <w:color w:val="0070C0"/>
+          <w:lang w:val="es-ES_tradnl"/>
+        </w:rPr>
+        <w:t>Villarrodrigo</w:t>
+      </w:r>
+      <w:proofErr w:type="spellEnd"/>
+      <w:r>
+        <w:rPr>
+          <w:color w:val="0070C0"/>
+          <w:lang w:val="es-ES_tradnl"/>
+        </w:rPr>
+        <w:t xml:space="preserve">: </w:t>
+      </w:r>
+      <w:r>
+        <w:rPr>
+          <w:lang w:val="es-ES_tradnl"/>
+        </w:rPr>
+        <w:t>le faltan años enteros. Si entra y sale de la media, crea saltos artificiales.</w:t>
+      </w:r>
+    </w:p>
+    <w:p>
+      <w:pPr>
+        <w:pStyle w:val="Prrafodelista"/>
+        <w:numPr>
+          <w:ilvl w:val="0"/>
+          <w:numId w:val="2"/>
+        </w:numPr>
+        <w:rPr>
+          <w:lang w:val="es-ES_tradnl"/>
+        </w:rPr>
+      </w:pPr>
+      <w:r>
+        <w:rPr>
+          <w:color w:val="0070C0"/>
+          <w:lang w:val="es-ES_tradnl"/>
+        </w:rPr>
+        <w:t xml:space="preserve">Quitar Granada Base Aérea: </w:t>
+      </w:r>
+      <w:r>
+        <w:rPr>
+          <w:lang w:val="es-ES_tradnl"/>
+        </w:rPr>
+        <w:t>está muy cerca de Granada Aeropuerto y Granada pesaría el doble.</w:t>
+      </w:r>
+    </w:p>
+    <w:p>
+      <w:pPr>
+        <w:pStyle w:val="Prrafodelista"/>
+        <w:numPr>
+          <w:ilvl w:val="0"/>
+          <w:numId w:val="2"/>
+        </w:numPr>
+        <w:rPr>
+          <w:lang w:val="es-ES_tradnl"/>
+        </w:rPr>
+      </w:pPr>
+      <w:r>
+        <w:rPr>
+          <w:color w:val="0070C0"/>
+          <w:lang w:val="es-ES_tradnl"/>
+        </w:rPr>
+        <w:t xml:space="preserve">5 estaciones finales: </w:t>
+      </w:r>
+      <w:r>
+        <w:t>Jaén, Córdoba Aeropuerto, Granada Aeropuerto, Sevilla Aeropuerto y Morón (una por zona).</w:t>
+      </w:r>
+    </w:p>
+    <w:p>
+      <w:pPr>
+        <w:rPr>
+          <w:color w:val="00B050"/>
+          <w:lang w:val="es-ES_tradnl"/>
+        </w:rPr>
+      </w:pPr>
+      <w:r>
+        <w:rPr>
+          <w:color w:val="00B050"/>
+          <w:lang w:val="es-ES_tradnl"/>
+        </w:rPr>
+        <w:t xml:space="preserve">Limpieza: </w:t>
+      </w:r>
+    </w:p>
+    <w:p>
+      <w:pPr>
+        <w:pStyle w:val="Prrafodelista"/>
+        <w:numPr>
+          <w:ilvl w:val="0"/>
+          <w:numId w:val="2"/>
+        </w:numPr>
+        <w:rPr>
+          <w:lang w:val="es-ES_tradnl"/>
+        </w:rPr>
+      </w:pPr>
+      <w:r>
+        <w:rPr>
+          <w:lang w:val="es-ES_tradnl"/>
+        </w:rPr>
+        <w:t>“</w:t>
+      </w:r>
+      <w:proofErr w:type="spellStart"/>
+      <w:r>
+        <w:rPr>
+          <w:lang w:val="es-ES_tradnl"/>
+        </w:rPr>
+        <w:t>Ip</w:t>
+      </w:r>
+      <w:proofErr w:type="spellEnd"/>
+      <w:r>
+        <w:rPr>
+          <w:lang w:val="es-ES_tradnl"/>
+        </w:rPr>
+        <w:t xml:space="preserve">” (lluvia inapreciable) </w:t>
+      </w:r>
+      <w:r>
+        <w:rPr>
+          <w:lang w:val="es-ES_tradnl"/>
+        </w:rPr>
+        <w:sym w:font="Wingdings" w:char="F0E0"/>
+      </w:r>
+      <w:r>
+        <w:rPr>
+          <w:lang w:val="es-ES_tradnl"/>
+        </w:rPr>
+        <w:t xml:space="preserve"> 0.</w:t>
+      </w:r>
+    </w:p>
+    <w:p>
+      <w:pPr>
+        <w:pStyle w:val="Prrafodelista"/>
+        <w:numPr>
+          <w:ilvl w:val="0"/>
+          <w:numId w:val="2"/>
+        </w:numPr>
+        <w:rPr>
+          <w:lang w:val="es-ES_tradnl"/>
+        </w:rPr>
+      </w:pPr>
+      <w:r>
+        <w:rPr>
+          <w:lang w:val="es-ES_tradnl"/>
+        </w:rPr>
+        <w:t xml:space="preserve">Coma decimal </w:t>
+      </w:r>
+      <w:r>
+        <w:rPr>
+          <w:lang w:val="es-ES_tradnl"/>
+        </w:rPr>
+        <w:sym w:font="Wingdings" w:char="F0E0"/>
+      </w:r>
+      <w:r>
+        <w:rPr>
+          <w:lang w:val="es-ES_tradnl"/>
+        </w:rPr>
+        <w:t xml:space="preserve"> punto, y conversión a número. </w:t>
+      </w:r>
+    </w:p>
+    <w:p>
+      <w:pPr>
+        <w:pStyle w:val="Prrafodelista"/>
+        <w:numPr>
+          <w:ilvl w:val="0"/>
+          <w:numId w:val="2"/>
+        </w:numPr>
+        <w:rPr>
+          <w:lang w:val="es-ES_tradnl"/>
+        </w:rPr>
+      </w:pPr>
+      <w:r>
+        <w:rPr>
+          <w:color w:val="0070C0"/>
+          <w:lang w:val="es-ES_tradnl"/>
+        </w:rPr>
+        <w:t xml:space="preserve">Solo dos variables: </w:t>
+      </w:r>
+      <w:proofErr w:type="spellStart"/>
+      <w:r>
+        <w:rPr>
+          <w:b/>
+          <w:bCs/>
+          <w:lang w:val="es-ES_tradnl"/>
+        </w:rPr>
+        <w:t>prec</w:t>
+      </w:r>
+      <w:proofErr w:type="spellEnd"/>
+      <w:r>
+        <w:rPr>
+          <w:lang w:val="es-ES_tradnl"/>
+        </w:rPr>
+        <w:t xml:space="preserve"> (lluvia diaria en mm; 1mm = </w:t>
+      </w:r>
+      <w:r>
+        <w:t>1 L/m²</w:t>
+      </w:r>
+      <w:r>
+        <w:rPr>
+          <w:lang w:val="es-ES_tradnl"/>
+        </w:rPr>
+        <w:t xml:space="preserve">) y </w:t>
+      </w:r>
+      <w:proofErr w:type="spellStart"/>
+      <w:r>
+        <w:rPr>
+          <w:b/>
+          <w:bCs/>
+          <w:lang w:val="es-ES_tradnl"/>
+        </w:rPr>
+        <w:t>tmed</w:t>
+      </w:r>
+      <w:proofErr w:type="spellEnd"/>
+      <w:r>
+        <w:rPr>
+          <w:lang w:val="es-ES_tradnl"/>
+        </w:rPr>
+        <w:t xml:space="preserve"> (temperatura media diaria en </w:t>
+      </w:r>
+      <w:r>
+        <w:t>°C</w:t>
+      </w:r>
+      <w:r>
+        <w:rPr>
+          <w:lang w:val="es-ES_tradnl"/>
+        </w:rPr>
+        <w:t>).</w:t>
+      </w:r>
+    </w:p>
+    <w:p>
+      <w:pPr>
+        <w:pStyle w:val="Prrafodelista"/>
+        <w:numPr>
+          <w:ilvl w:val="0"/>
+          <w:numId w:val="2"/>
+        </w:numPr>
+        <w:rPr>
+          <w:lang w:val="es-ES_tradnl"/>
+        </w:rPr>
+      </w:pPr>
+      <w:r>
+        <w:rPr>
+          <w:color w:val="0070C0"/>
+          <w:lang w:val="es-ES_tradnl"/>
+        </w:rPr>
+        <w:t xml:space="preserve">Pocos nulos (7 de lluvia, 217 temperatura): </w:t>
+      </w:r>
+      <w:r>
+        <w:rPr>
+          <w:lang w:val="es-ES_tradnl"/>
+        </w:rPr>
+        <w:t xml:space="preserve">se usa la media de las estaciones que sí tienen datos. </w:t>
+      </w:r>
+    </w:p>
+    <w:p>
+      <w:pPr>
+        <w:rPr>
+          <w:lang w:val="es-ES_tradnl"/>
+        </w:rPr>
+      </w:pPr>
+    </w:p>
+    <w:p>
+      <w:pPr>
+        <w:rPr>
+          <w:color w:val="00B050"/>
+          <w:lang w:val="es-ES_tradnl"/>
+        </w:rPr>
+      </w:pPr>
+      <w:r>
+        <w:rPr>
+          <w:color w:val="00B050"/>
+          <w:lang w:val="es-ES_tradnl"/>
+        </w:rPr>
+        <w:lastRenderedPageBreak/>
+        <w:t xml:space="preserve">Paso a semanal: </w:t>
+      </w:r>
+    </w:p>
+    <w:p>
+      <w:pPr>
+        <w:pStyle w:val="Prrafodelista"/>
+        <w:numPr>
+          <w:ilvl w:val="0"/>
+          <w:numId w:val="2"/>
+        </w:numPr>
+        <w:rPr>
+          <w:lang w:val="es-ES_tradnl"/>
+        </w:rPr>
+      </w:pPr>
+      <w:r>
+        <w:rPr>
+          <w:color w:val="0070C0"/>
+          <w:lang w:val="es-ES_tradnl"/>
+        </w:rPr>
+        <w:t xml:space="preserve">Media diaria de las 5 estaciones: </w:t>
+      </w:r>
+      <w:r>
+        <w:rPr>
+          <w:lang w:val="es-ES_tradnl"/>
+        </w:rPr>
+        <w:t>semanas que terminan en martes: lluvia sumada y temperatura media.</w:t>
+      </w:r>
+    </w:p>
+    <w:p>
+      <w:pPr>
+        <w:pStyle w:val="Prrafodelista"/>
+        <w:numPr>
+          <w:ilvl w:val="0"/>
+          <w:numId w:val="2"/>
+        </w:numPr>
+        <w:rPr>
+          <w:lang w:val="es-ES_tradnl"/>
+        </w:rPr>
+      </w:pPr>
+      <w:r>
+        <w:rPr>
+          <w:lang w:val="es-ES_tradnl"/>
+        </w:rPr>
+        <w:t>Las 1.708 semanas coinciden con las de los embalses.</w:t>
+      </w:r>
+    </w:p>
+    <w:p>
+      <w:pPr>
+        <w:pStyle w:val="Prrafodelista"/>
+        <w:numPr>
+          <w:ilvl w:val="0"/>
+          <w:numId w:val="2"/>
+        </w:numPr>
+        <w:rPr>
+          <w:lang w:val="es-ES_tradnl"/>
+        </w:rPr>
+      </w:pPr>
+      <w:r>
+        <w:rPr>
+          <w:lang w:val="es-ES_tradnl"/>
+        </w:rPr>
+        <w:t xml:space="preserve">Guardado en </w:t>
+      </w:r>
+      <w:proofErr w:type="spellStart"/>
+      <w:r>
+        <w:rPr>
+          <w:b/>
+          <w:bCs/>
+          <w:i/>
+          <w:iCs/>
+          <w:lang w:val="es-ES_tradnl"/>
+        </w:rPr>
+        <w:t>clima_</w:t>
+      </w:r>
+      <w:proofErr w:type="gramStart"/>
+      <w:r>
+        <w:rPr>
+          <w:b/>
+          <w:bCs/>
+          <w:i/>
+          <w:iCs/>
+          <w:lang w:val="es-ES_tradnl"/>
+        </w:rPr>
+        <w:t>semanal.parquet</w:t>
+      </w:r>
+      <w:proofErr w:type="spellEnd"/>
+      <w:proofErr w:type="gramEnd"/>
+      <w:r>
+        <w:rPr>
+          <w:b/>
+          <w:bCs/>
+          <w:i/>
+          <w:iCs/>
+          <w:lang w:val="es-ES_tradnl"/>
+        </w:rPr>
+        <w:t>.</w:t>
+      </w:r>
+    </w:p>
+    <w:p>
+      <w:pPr>
+        <w:pStyle w:val="Prrafodelista"/>
+        <w:rPr>
+          <w:lang w:val="es-ES_tradnl"/>
+        </w:rPr>
+      </w:pPr>
+    </w:p>
+    <w:p>
+      <w:pPr>
+        <w:rPr>
+          <w:lang w:val="es-ES_tradnl"/>
+        </w:rPr>
+      </w:pPr>
+    </w:p>
+    <w:p>
+      <w:pPr>
+        <w:rPr>
+          <w:lang w:val="es-ES_tradnl"/>
+        </w:rPr>
+      </w:pPr>
+    </w:p>
+    <w:p>
+      <w:pPr>
+        <w:rPr>
+          <w:lang w:val="es-ES_tradnl"/>
+        </w:rPr>
+      </w:pPr>
+    </w:p>
+    <w:p>
+      <w:pPr>
+        <w:rPr>
+          <w:lang w:val="es-ES_tradnl"/>
+        </w:rPr>
+      </w:pPr>
+    </w:p>
+    <w:p>
+      <w:pPr>
+        <w:rPr>
+          <w:lang w:val="es-ES_tradnl"/>
+        </w:rPr>
+      </w:pPr>
+    </w:p>
+    <w:p>
+      <w:pPr>
+        <w:rPr>
+          <w:lang w:val="es-ES_tradnl"/>
+        </w:rPr>
+      </w:pPr>
+    </w:p>
+    <w:p>
+      <w:pPr>
+        <w:rPr>
+          <w:lang w:val="es-ES_tradnl"/>
+        </w:rPr>
+      </w:pPr>
+    </w:p>
+    <w:p>
+      <w:pPr>
+        <w:rPr>
+          <w:lang w:val="es-ES_tradnl"/>
+        </w:rPr>
+      </w:pPr>
+    </w:p>
+    <w:p>
+      <w:pPr>
+        <w:rPr>
+          <w:lang w:val="es-ES_tradnl"/>
+        </w:rPr>
+      </w:pPr>
+    </w:p>
+    <w:p>
+      <w:pPr>
+        <w:rPr>
+          <w:lang w:val="es-ES_tradnl"/>
+        </w:rPr>
+      </w:pPr>
+    </w:p>
+    <w:p>
+      <w:pPr>
+        <w:rPr>
+          <w:lang w:val="es-ES_tradnl"/>
+        </w:rPr>
+      </w:pPr>
+    </w:p>
+    <w:p>
+      <w:pPr>
+        <w:rPr>
+          <w:lang w:val="es-ES_tradnl"/>
+        </w:rPr>
+      </w:pPr>
+    </w:p>
+    <w:p>
+      <w:pPr>
+        <w:rPr>
+          <w:lang w:val="es-ES_tradnl"/>
+        </w:rPr>
+      </w:pPr>
+    </w:p>
+    <w:p>
+      <w:pPr>
+        <w:rPr>
+          <w:lang w:val="es-ES_tradnl"/>
+        </w:rPr>
+      </w:pPr>
+    </w:p>
+    <w:p>
+      <w:pPr>
+        <w:rPr>
+          <w:lang w:val="es-ES_tradnl"/>
+        </w:rPr>
+      </w:pPr>
+    </w:p>
+    <w:p>
+      <w:pPr>
+        <w:rPr>
+          <w:lang w:val="es-ES_tradnl"/>
+        </w:rPr>
+      </w:pPr>
+    </w:p>
+    <w:p>
+      <w:pPr>
+        <w:rPr>
+          <w:lang w:val="es-ES_tradnl"/>
+        </w:rPr>
+      </w:pPr>
+    </w:p>
+    <w:p>
+      <w:pPr>
+        <w:rPr>
+          <w:lang w:val="es-ES_tradnl"/>
+        </w:rPr>
+      </w:pPr>
+    </w:p>
+    <w:p>
+      <w:pPr>
+        <w:rPr>
+          <w:lang w:val="es-ES_tradnl"/>
+        </w:rPr>
+      </w:pPr>
+    </w:p>
+    <w:p>
+      <w:pPr>
+        <w:rPr>
+          <w:lang w:val="es-ES_tradnl"/>
+        </w:rPr>
+      </w:pPr>
+    </w:p>
+    <w:p>
+      <w:pPr>
+        <w:rPr>
+          <w:lang w:val="es-ES_tradnl"/>
+        </w:rPr>
+      </w:pPr>
+    </w:p>
+    <w:p>
+      <w:pPr>
+        <w:rPr>
+          <w:lang w:val="es-ES_tradnl"/>
+        </w:rPr>
+      </w:pPr>
+    </w:p>
+    <w:p>
+      <w:pPr>
+        <w:rPr>
+          <w:lang w:val="es-ES_tradnl"/>
+        </w:rPr>
+      </w:pPr>
+    </w:p>
+    <w:p>
+      <w:pPr>
+        <w:rPr>
+          <w:lang w:val="es-ES_tradnl"/>
+        </w:rPr>
+      </w:pPr>
+    </w:p>
+    <w:p>
+      <w:pPr>
+        <w:rPr>
+          <w:lang w:val="es-ES_tradnl"/>
+        </w:rPr>
+      </w:pPr>
+    </w:p>
+    <w:p>
+      <w:pPr>
+        <w:rPr>
+          <w:lang w:val="es-ES_tradnl"/>
+        </w:rPr>
+      </w:pPr>
+    </w:p>
+    <w:p>
+      <w:pPr>
+        <w:rPr>
+          <w:lang w:val="es-ES_tradnl"/>
+        </w:rPr>
+      </w:pPr>
+    </w:p>
+    <w:p>
+      <w:pPr>
+        <w:rPr>
+          <w:lang w:val="es-ES_tradnl"/>
+        </w:rPr>
+      </w:pPr>
+    </w:p>
+    <w:p>
+      <w:pPr>
+        <w:rPr>
+          <w:lang w:val="es-ES_tradnl"/>
+        </w:rPr>
+      </w:pPr>
+    </w:p>
+    <w:p>
+      <w:pPr>
+        <w:rPr>
+          <w:lang w:val="es-ES_tradnl"/>
+        </w:rPr>
+      </w:pPr>
+    </w:p>
+    <w:p>
+      <w:pPr>
+        <w:rPr>
+          <w:color w:val="EE0000"/>
+          <w:lang w:val="es-ES_tradnl"/>
+        </w:rPr>
+      </w:pPr>
+      <w:r>
+        <w:rPr>
+          <w:color w:val="EE0000"/>
+          <w:lang w:val="es-ES_tradnl"/>
+        </w:rPr>
+        <w:t>Conceptos nuevos/repaso:</w:t>
+      </w:r>
+    </w:p>
+    <w:p>
+      <w:pPr>
+        <w:pStyle w:val="Prrafodelista"/>
+        <w:numPr>
+          <w:ilvl w:val="0"/>
+          <w:numId w:val="2"/>
+        </w:numPr>
+        <w:rPr>
+          <w:lang w:val="es-ES_tradnl"/>
+        </w:rPr>
+      </w:pPr>
+      <w:r>
+        <w:rPr>
+          <w:b/>
+          <w:bCs/>
+          <w:lang w:val="es-ES_tradnl"/>
+        </w:rPr>
         <w:t>Parquet:</w:t>
       </w:r>
       <w:r>
@@ -1899,6 +2345,50 @@
           <w:lang w:val="es-ES_tradnl"/>
         </w:rPr>
         <w:t xml:space="preserve"> formato de tabla comprimido que guarda los tipos de cada columna. Es el estándar para datos procesados.</w:t>
+      </w:r>
+    </w:p>
+    <w:p>
+      <w:pPr>
+        <w:pStyle w:val="Prrafodelista"/>
+        <w:numPr>
+          <w:ilvl w:val="0"/>
+          <w:numId w:val="2"/>
+        </w:numPr>
+        <w:rPr>
+          <w:lang w:val="es-ES_tradnl"/>
+        </w:rPr>
+      </w:pPr>
+      <w:r>
+        <w:rPr>
+          <w:b/>
+          <w:bCs/>
+          <w:lang w:val="es-ES_tradnl"/>
+        </w:rPr>
+        <w:t xml:space="preserve">Data </w:t>
+      </w:r>
+      <w:proofErr w:type="spellStart"/>
+      <w:r>
+        <w:rPr>
+          <w:b/>
+          <w:bCs/>
+          <w:lang w:val="es-ES_tradnl"/>
+        </w:rPr>
+        <w:t>leakage</w:t>
+      </w:r>
+      <w:proofErr w:type="spellEnd"/>
+      <w:r>
+        <w:rPr>
+          <w:b/>
+          <w:bCs/>
+          <w:lang w:val="es-ES_tradnl"/>
+        </w:rPr>
+        <w:t xml:space="preserve"> temporal:</w:t>
+      </w:r>
+      <w:r>
+        <w:rPr>
+          <w:lang w:val="es-ES_tradnl"/>
+        </w:rPr>
+        <w:t xml:space="preserve"> usar información posterior al momento de la predicción. Se evita usando solo datos hasta la fecha de cada fila.</w:t>
       </w:r>
     </w:p>
     <w:sectPr>

</xml_diff>

<commit_message>
Feature engineering: lags, acumulados y objetivos
</commit_message>
<xml_diff>
--- a/docs/Proyecto Observatorio Sequia Guadalquivir.docx
+++ b/docs/Proyecto Observatorio Sequia Guadalquivir.docx
@@ -391,18 +391,51 @@
           <w:lang w:val="es-ES_tradnl"/>
         </w:rPr>
       </w:pPr>
-      <w:r>
-        <w:rPr>
-          <w:color w:val="0070C0"/>
-          <w:lang w:val="es-ES_tradnl"/>
-        </w:rPr>
-        <w:t xml:space="preserve">Feature engineering: </w:t>
-      </w:r>
-      <w:r>
-        <w:rPr>
-          <w:lang w:val="es-ES_tradnl"/>
-        </w:rPr>
-        <w:t>lags, lluvia acumulada, semana del año.</w:t>
+      <w:proofErr w:type="spellStart"/>
+      <w:r>
+        <w:rPr>
+          <w:color w:val="0070C0"/>
+          <w:lang w:val="es-ES_tradnl"/>
+        </w:rPr>
+        <w:t>Feature</w:t>
+      </w:r>
+      <w:proofErr w:type="spellEnd"/>
+      <w:r>
+        <w:rPr>
+          <w:color w:val="0070C0"/>
+          <w:lang w:val="es-ES_tradnl"/>
+        </w:rPr>
+        <w:t xml:space="preserve"> </w:t>
+      </w:r>
+      <w:proofErr w:type="spellStart"/>
+      <w:r>
+        <w:rPr>
+          <w:color w:val="0070C0"/>
+          <w:lang w:val="es-ES_tradnl"/>
+        </w:rPr>
+        <w:t>engineering</w:t>
+      </w:r>
+      <w:proofErr w:type="spellEnd"/>
+      <w:r>
+        <w:rPr>
+          <w:color w:val="0070C0"/>
+          <w:lang w:val="es-ES_tradnl"/>
+        </w:rPr>
+        <w:t xml:space="preserve">: </w:t>
+      </w:r>
+      <w:proofErr w:type="spellStart"/>
+      <w:r>
+        <w:rPr>
+          <w:lang w:val="es-ES_tradnl"/>
+        </w:rPr>
+        <w:t>lags</w:t>
+      </w:r>
+      <w:proofErr w:type="spellEnd"/>
+      <w:r>
+        <w:rPr>
+          <w:lang w:val="es-ES_tradnl"/>
+        </w:rPr>
+        <w:t>, lluvia acumulada, semana del año.</w:t>
       </w:r>
     </w:p>
     <w:p>
@@ -423,11 +456,19 @@
         </w:rPr>
         <w:t xml:space="preserve">Modelado: </w:t>
       </w:r>
-      <w:r>
-        <w:rPr>
-          <w:lang w:val="es-ES_tradnl"/>
-        </w:rPr>
-        <w:t xml:space="preserve">baselines </w:t>
+      <w:proofErr w:type="spellStart"/>
+      <w:r>
+        <w:rPr>
+          <w:lang w:val="es-ES_tradnl"/>
+        </w:rPr>
+        <w:t>baselines</w:t>
+      </w:r>
+      <w:proofErr w:type="spellEnd"/>
+      <w:r>
+        <w:rPr>
+          <w:lang w:val="es-ES_tradnl"/>
+        </w:rPr>
+        <w:t xml:space="preserve"> </w:t>
       </w:r>
       <w:r>
         <w:rPr>
@@ -463,7 +504,21 @@
         <w:rPr>
           <w:lang w:val="es-ES_tradnl"/>
         </w:rPr>
-        <w:t xml:space="preserve"> XGBoost.</w:t>
+        <w:t xml:space="preserve"> </w:t>
+      </w:r>
+      <w:proofErr w:type="spellStart"/>
+      <w:r>
+        <w:rPr>
+          <w:lang w:val="es-ES_tradnl"/>
+        </w:rPr>
+        <w:t>XGBoost</w:t>
+      </w:r>
+      <w:proofErr w:type="spellEnd"/>
+      <w:r>
+        <w:rPr>
+          <w:lang w:val="es-ES_tradnl"/>
+        </w:rPr>
+        <w:t>.</w:t>
       </w:r>
     </w:p>
     <w:p>
@@ -793,7 +848,39 @@
           <w:color w:val="0070C0"/>
           <w:lang w:val="es-ES_tradnl"/>
         </w:rPr>
-        <w:t xml:space="preserve"> (Negratin 100, Giribaile 5): </w:t>
+        <w:t xml:space="preserve"> (</w:t>
+      </w:r>
+      <w:proofErr w:type="spellStart"/>
+      <w:r>
+        <w:rPr>
+          <w:color w:val="0070C0"/>
+          <w:lang w:val="es-ES_tradnl"/>
+        </w:rPr>
+        <w:t>Negratin</w:t>
+      </w:r>
+      <w:proofErr w:type="spellEnd"/>
+      <w:r>
+        <w:rPr>
+          <w:color w:val="0070C0"/>
+          <w:lang w:val="es-ES_tradnl"/>
+        </w:rPr>
+        <w:t xml:space="preserve"> 100, </w:t>
+      </w:r>
+      <w:proofErr w:type="spellStart"/>
+      <w:r>
+        <w:rPr>
+          <w:color w:val="0070C0"/>
+          <w:lang w:val="es-ES_tradnl"/>
+        </w:rPr>
+        <w:t>Giribaile</w:t>
+      </w:r>
+      <w:proofErr w:type="spellEnd"/>
+      <w:r>
+        <w:rPr>
+          <w:color w:val="0070C0"/>
+          <w:lang w:val="es-ES_tradnl"/>
+        </w:rPr>
+        <w:t xml:space="preserve"> 5): </w:t>
       </w:r>
       <w:r>
         <w:rPr>
@@ -881,7 +968,21 @@
         <w:rPr>
           <w:lang w:val="es-ES_tradnl"/>
         </w:rPr>
-        <w:t xml:space="preserve">si entran o salen embalses, el total da saltos que no son lluvia ni sequia. </w:t>
+        <w:t xml:space="preserve">si entran o salen embalses, el total da saltos que no son lluvia ni </w:t>
+      </w:r>
+      <w:proofErr w:type="spellStart"/>
+      <w:r>
+        <w:rPr>
+          <w:lang w:val="es-ES_tradnl"/>
+        </w:rPr>
+        <w:t>sequia</w:t>
+      </w:r>
+      <w:proofErr w:type="spellEnd"/>
+      <w:r>
+        <w:rPr>
+          <w:lang w:val="es-ES_tradnl"/>
+        </w:rPr>
+        <w:t xml:space="preserve">. </w:t>
       </w:r>
     </w:p>
     <w:p>
@@ -918,10 +1019,7 @@
         <w:t xml:space="preserve"> </w:t>
       </w:r>
       <w:r>
-        <w:t>hm³</w:t>
-      </w:r>
-      <w:r>
-        <w:t xml:space="preserve"> y se llena con bombeo; el modelo no puede explicarlo con la lluvia.</w:t>
+        <w:t>hm³ y se llena con bombeo; el modelo no puede explicarlo con la lluvia.</w:t>
       </w:r>
     </w:p>
     <w:p>
@@ -950,6 +1048,7 @@
           <w:lang w:val="es-ES_tradnl"/>
         </w:rPr>
       </w:pPr>
+      <w:proofErr w:type="spellStart"/>
       <w:r>
         <w:rPr>
           <w:i/>
@@ -957,33 +1056,9 @@
           <w:color w:val="0070C0"/>
           <w:lang w:val="es-ES_tradnl"/>
         </w:rPr>
-        <w:t>Embalses_guadalquivir.parquet:</w:t>
-      </w:r>
-      <w:r>
-        <w:rPr>
-          <w:color w:val="0070C0"/>
-          <w:lang w:val="es-ES_tradnl"/>
-        </w:rPr>
-        <w:t xml:space="preserve"> </w:t>
-      </w:r>
-      <w:r>
-        <w:rPr>
-          <w:lang w:val="es-ES_tradnl"/>
-        </w:rPr>
-        <w:t>datos limpios por embalse.</w:t>
-      </w:r>
-    </w:p>
-    <w:p>
-      <w:pPr>
-        <w:pStyle w:val="Prrafodelista"/>
-        <w:numPr>
-          <w:ilvl w:val="0"/>
-          <w:numId w:val="2"/>
-        </w:numPr>
-        <w:rPr>
-          <w:lang w:val="es-ES_tradnl"/>
-        </w:rPr>
-      </w:pPr>
+        <w:t>Embalses_</w:t>
+      </w:r>
+      <w:proofErr w:type="gramStart"/>
       <w:r>
         <w:rPr>
           <w:i/>
@@ -991,8 +1066,66 @@
           <w:color w:val="0070C0"/>
           <w:lang w:val="es-ES_tradnl"/>
         </w:rPr>
-        <w:t>Cuenca_semanal.parquet</w:t>
-      </w:r>
+        <w:t>guadalquivir.parquet</w:t>
+      </w:r>
+      <w:proofErr w:type="spellEnd"/>
+      <w:proofErr w:type="gramEnd"/>
+      <w:r>
+        <w:rPr>
+          <w:i/>
+          <w:iCs/>
+          <w:color w:val="0070C0"/>
+          <w:lang w:val="es-ES_tradnl"/>
+        </w:rPr>
+        <w:t>:</w:t>
+      </w:r>
+      <w:r>
+        <w:rPr>
+          <w:color w:val="0070C0"/>
+          <w:lang w:val="es-ES_tradnl"/>
+        </w:rPr>
+        <w:t xml:space="preserve"> </w:t>
+      </w:r>
+      <w:r>
+        <w:rPr>
+          <w:lang w:val="es-ES_tradnl"/>
+        </w:rPr>
+        <w:t>datos limpios por embalse.</w:t>
+      </w:r>
+    </w:p>
+    <w:p>
+      <w:pPr>
+        <w:pStyle w:val="Prrafodelista"/>
+        <w:numPr>
+          <w:ilvl w:val="0"/>
+          <w:numId w:val="2"/>
+        </w:numPr>
+        <w:rPr>
+          <w:lang w:val="es-ES_tradnl"/>
+        </w:rPr>
+      </w:pPr>
+      <w:proofErr w:type="spellStart"/>
+      <w:r>
+        <w:rPr>
+          <w:i/>
+          <w:iCs/>
+          <w:color w:val="0070C0"/>
+          <w:lang w:val="es-ES_tradnl"/>
+        </w:rPr>
+        <w:t>Cuenca_</w:t>
+      </w:r>
+      <w:proofErr w:type="gramStart"/>
+      <w:r>
+        <w:rPr>
+          <w:i/>
+          <w:iCs/>
+          <w:color w:val="0070C0"/>
+          <w:lang w:val="es-ES_tradnl"/>
+        </w:rPr>
+        <w:t>semanal.parquet</w:t>
+      </w:r>
+      <w:proofErr w:type="spellEnd"/>
+      <w:proofErr w:type="gramEnd"/>
       <w:r>
         <w:rPr>
           <w:color w:val="0070C0"/>
@@ -1052,7 +1185,21 @@
         <w:rPr>
           <w:lang w:val="es-ES_tradnl"/>
         </w:rPr>
-        <w:t xml:space="preserve"> descargar la lluvia y temperatura diaria de estaciones de la cuenca desde 1994 hasta hoy, usando la API de AEMET OpenData.</w:t>
+        <w:t xml:space="preserve"> descargar la lluvia y temperatura diaria de estaciones de la cuenca desde 1994 hasta hoy, usando la API de AEMET </w:t>
+      </w:r>
+      <w:proofErr w:type="spellStart"/>
+      <w:r>
+        <w:rPr>
+          <w:lang w:val="es-ES_tradnl"/>
+        </w:rPr>
+        <w:t>OpenData</w:t>
+      </w:r>
+      <w:proofErr w:type="spellEnd"/>
+      <w:r>
+        <w:rPr>
+          <w:lang w:val="es-ES_tradnl"/>
+        </w:rPr>
+        <w:t>.</w:t>
       </w:r>
     </w:p>
     <w:p>
@@ -1111,8 +1258,38 @@
         <w:rPr>
           <w:lang w:val="es-ES_tradnl"/>
         </w:rPr>
-        <w:t>API key gratuita guardada en .env</w:t>
-      </w:r>
+        <w:t xml:space="preserve">API </w:t>
+      </w:r>
+      <w:proofErr w:type="spellStart"/>
+      <w:r>
+        <w:rPr>
+          <w:lang w:val="es-ES_tradnl"/>
+        </w:rPr>
+        <w:t>key</w:t>
+      </w:r>
+      <w:proofErr w:type="spellEnd"/>
+      <w:r>
+        <w:rPr>
+          <w:lang w:val="es-ES_tradnl"/>
+        </w:rPr>
+        <w:t xml:space="preserve"> gratuita guardada </w:t>
+      </w:r>
+      <w:proofErr w:type="gramStart"/>
+      <w:r>
+        <w:rPr>
+          <w:lang w:val="es-ES_tradnl"/>
+        </w:rPr>
+        <w:t>en .</w:t>
+      </w:r>
+      <w:proofErr w:type="spellStart"/>
+      <w:r>
+        <w:rPr>
+          <w:lang w:val="es-ES_tradnl"/>
+        </w:rPr>
+        <w:t>env</w:t>
+      </w:r>
+      <w:proofErr w:type="spellEnd"/>
+      <w:proofErr w:type="gramEnd"/>
     </w:p>
     <w:p>
       <w:pPr>
@@ -1161,7 +1338,21 @@
         <w:rPr>
           <w:lang w:val="es-ES_tradnl"/>
         </w:rPr>
-        <w:t xml:space="preserve">máximo 6 meses por petición y un numero de peticiones por minuto limitado (error 429) </w:t>
+        <w:t xml:space="preserve">máximo 6 meses por petición y un </w:t>
+      </w:r>
+      <w:proofErr w:type="spellStart"/>
+      <w:r>
+        <w:rPr>
+          <w:lang w:val="es-ES_tradnl"/>
+        </w:rPr>
+        <w:t>numero</w:t>
+      </w:r>
+      <w:proofErr w:type="spellEnd"/>
+      <w:r>
+        <w:rPr>
+          <w:lang w:val="es-ES_tradnl"/>
+        </w:rPr>
+        <w:t xml:space="preserve"> de peticiones por minuto limitado (error 429) </w:t>
       </w:r>
       <w:r>
         <w:rPr>
@@ -1246,7 +1437,14 @@
         <w:rPr>
           <w:lang w:val="es-ES_tradnl"/>
         </w:rPr>
-        <w:t>Jaén, Córdoba Aeropuerto, Granada Base Aérea, Granada Aeropuerto, Sevilla Aeropuerto, Morón y Villa</w:t>
+        <w:t xml:space="preserve">Jaén, Córdoba Aeropuerto, Granada Base Aérea, Granada Aeropuerto, Sevilla Aeropuerto, Morón y </w:t>
+      </w:r>
+      <w:proofErr w:type="spellStart"/>
+      <w:r>
+        <w:rPr>
+          <w:lang w:val="es-ES_tradnl"/>
+        </w:rPr>
+        <w:t>Villa</w:t>
       </w:r>
       <w:r>
         <w:rPr>
@@ -1258,7 +1456,14 @@
         <w:rPr>
           <w:lang w:val="es-ES_tradnl"/>
         </w:rPr>
-        <w:t xml:space="preserve">rodrigo. Huelva queda fuera por estar en la costa y fuera de la cuenca. </w:t>
+        <w:t>rodrigo</w:t>
+      </w:r>
+      <w:proofErr w:type="spellEnd"/>
+      <w:r>
+        <w:rPr>
+          <w:lang w:val="es-ES_tradnl"/>
+        </w:rPr>
+        <w:t xml:space="preserve">. Huelva queda fuera por estar en la costa y fuera de la cuenca. </w:t>
       </w:r>
     </w:p>
     <w:p>
@@ -1335,7 +1540,23 @@
           <w:color w:val="0070C0"/>
           <w:lang w:val="es-ES_tradnl"/>
         </w:rPr>
-        <w:t xml:space="preserve">Try/except: </w:t>
+        <w:t>Try/</w:t>
+      </w:r>
+      <w:proofErr w:type="spellStart"/>
+      <w:r>
+        <w:rPr>
+          <w:color w:val="0070C0"/>
+          <w:lang w:val="es-ES_tradnl"/>
+        </w:rPr>
+        <w:t>except</w:t>
+      </w:r>
+      <w:proofErr w:type="spellEnd"/>
+      <w:r>
+        <w:rPr>
+          <w:color w:val="0070C0"/>
+          <w:lang w:val="es-ES_tradnl"/>
+        </w:rPr>
+        <w:t xml:space="preserve">: </w:t>
       </w:r>
       <w:r>
         <w:rPr>
@@ -1367,8 +1588,18 @@
           <w:iCs/>
           <w:lang w:val="es-ES_tradnl"/>
         </w:rPr>
-        <w:t>data/raw/aemet</w:t>
-      </w:r>
+        <w:t>data/raw/</w:t>
+      </w:r>
+      <w:proofErr w:type="spellStart"/>
+      <w:r>
+        <w:rPr>
+          <w:i/>
+          <w:iCs/>
+          <w:lang w:val="es-ES_tradnl"/>
+        </w:rPr>
+        <w:t>aemet</w:t>
+      </w:r>
+      <w:proofErr w:type="spellEnd"/>
       <w:r>
         <w:rPr>
           <w:lang w:val="es-ES_tradnl"/>
@@ -1495,7 +1726,23 @@
           <w:color w:val="0070C0"/>
           <w:lang w:val="es-ES_tradnl"/>
         </w:rPr>
-        <w:t xml:space="preserve">Quitar Villarrodrigo: </w:t>
+        <w:t xml:space="preserve">Quitar </w:t>
+      </w:r>
+      <w:proofErr w:type="spellStart"/>
+      <w:r>
+        <w:rPr>
+          <w:color w:val="0070C0"/>
+          <w:lang w:val="es-ES_tradnl"/>
+        </w:rPr>
+        <w:t>Villarrodrigo</w:t>
+      </w:r>
+      <w:proofErr w:type="spellEnd"/>
+      <w:r>
+        <w:rPr>
+          <w:color w:val="0070C0"/>
+          <w:lang w:val="es-ES_tradnl"/>
+        </w:rPr>
+        <w:t xml:space="preserve">: </w:t>
       </w:r>
       <w:r>
         <w:rPr>
@@ -1581,7 +1828,21 @@
         <w:rPr>
           <w:lang w:val="es-ES_tradnl"/>
         </w:rPr>
-        <w:t xml:space="preserve">“Ip” (lluvia inapreciable) </w:t>
+        <w:t>“</w:t>
+      </w:r>
+      <w:proofErr w:type="spellStart"/>
+      <w:r>
+        <w:rPr>
+          <w:lang w:val="es-ES_tradnl"/>
+        </w:rPr>
+        <w:t>Ip</w:t>
+      </w:r>
+      <w:proofErr w:type="spellEnd"/>
+      <w:r>
+        <w:rPr>
+          <w:lang w:val="es-ES_tradnl"/>
+        </w:rPr>
+        <w:t xml:space="preserve">” (lluvia inapreciable) </w:t>
       </w:r>
       <w:r>
         <w:rPr>
@@ -1644,6 +1905,7 @@
         </w:rPr>
         <w:t xml:space="preserve">Solo dos variables: </w:t>
       </w:r>
+      <w:proofErr w:type="spellStart"/>
       <w:r>
         <w:rPr>
           <w:b/>
@@ -1652,6 +1914,7 @@
         </w:rPr>
         <w:t>prec</w:t>
       </w:r>
+      <w:proofErr w:type="spellEnd"/>
       <w:r>
         <w:rPr>
           <w:lang w:val="es-ES_tradnl"/>
@@ -1667,6 +1930,7 @@
         </w:rPr>
         <w:t xml:space="preserve">) y </w:t>
       </w:r>
+      <w:proofErr w:type="spellStart"/>
       <w:r>
         <w:rPr>
           <w:b/>
@@ -1675,6 +1939,7 @@
         </w:rPr>
         <w:t>tmed</w:t>
       </w:r>
+      <w:proofErr w:type="spellEnd"/>
       <w:r>
         <w:rPr>
           <w:lang w:val="es-ES_tradnl"/>
@@ -1799,6 +2064,7 @@
         </w:rPr>
         <w:t xml:space="preserve">Guardado en </w:t>
       </w:r>
+      <w:proofErr w:type="spellStart"/>
       <w:r>
         <w:rPr>
           <w:b/>
@@ -1807,428 +2073,462 @@
           <w:iCs/>
           <w:lang w:val="es-ES_tradnl"/>
         </w:rPr>
-        <w:t>clima_semanal.parquet.</w:t>
-      </w:r>
-    </w:p>
-    <w:p>
-      <w:pPr>
-        <w:rPr>
-          <w:lang w:val="es-ES_tradnl"/>
-        </w:rPr>
-      </w:pPr>
-    </w:p>
-    <w:p>
-      <w:pPr>
-        <w:rPr>
-          <w:lang w:val="es-ES_tradnl"/>
-        </w:rPr>
-      </w:pPr>
-    </w:p>
-    <w:p>
-      <w:pPr>
-        <w:rPr>
-          <w:color w:val="EE0000"/>
-          <w:lang w:val="es-ES_tradnl"/>
-        </w:rPr>
-      </w:pPr>
-      <w:r>
-        <w:rPr>
-          <w:color w:val="EE0000"/>
-          <w:lang w:val="es-ES_tradnl"/>
-        </w:rPr>
-        <w:t>8. EDA</w:t>
-      </w:r>
-      <w:r>
-        <w:rPr>
-          <w:color w:val="EE0000"/>
-          <w:lang w:val="es-ES_tradnl"/>
-        </w:rPr>
-        <w:t xml:space="preserve"> (Análisis Exploratorio)</w:t>
-      </w:r>
-    </w:p>
-    <w:p>
-      <w:pPr>
-        <w:pStyle w:val="Prrafodelista"/>
-        <w:numPr>
-          <w:ilvl w:val="0"/>
-          <w:numId w:val="2"/>
-        </w:numPr>
-        <w:rPr>
-          <w:lang w:val="es-ES_tradnl"/>
-        </w:rPr>
-      </w:pPr>
+        <w:t>clima_</w:t>
+      </w:r>
+      <w:proofErr w:type="gramStart"/>
       <w:r>
         <w:rPr>
           <w:b/>
           <w:bCs/>
-          <w:lang w:val="es-ES_tradnl"/>
-        </w:rPr>
-        <w:t>Qué es:</w:t>
-      </w:r>
-      <w:r>
-        <w:rPr>
-          <w:lang w:val="es-ES_tradnl"/>
-        </w:rPr>
-        <w:t xml:space="preserve"> entender cómo se comportan los datos antes de modelar, y qué variables necesitará el modelo.</w:t>
-      </w:r>
-    </w:p>
-    <w:p>
-      <w:pPr>
-        <w:rPr>
-          <w:color w:val="00B050"/>
-          <w:lang w:val="es-ES_tradnl"/>
-        </w:rPr>
-      </w:pPr>
-      <w:r>
-        <w:rPr>
-          <w:color w:val="00B050"/>
-          <w:lang w:val="es-ES_tradnl"/>
-        </w:rPr>
-        <w:t>Conclusiones:</w:t>
-      </w:r>
-    </w:p>
-    <w:p>
-      <w:pPr>
-        <w:pStyle w:val="Prrafodelista"/>
-        <w:numPr>
-          <w:ilvl w:val="0"/>
-          <w:numId w:val="4"/>
-        </w:numPr>
-        <w:rPr>
-          <w:lang w:val="es-ES_tradnl"/>
-        </w:rPr>
-      </w:pPr>
-      <w:r>
-        <w:rPr>
-          <w:color w:val="0070C0"/>
-          <w:lang w:val="es-ES_tradnl"/>
-        </w:rPr>
-        <w:t xml:space="preserve">Estacionalidad: </w:t>
-      </w:r>
-      <w:r>
-        <w:rPr>
-          <w:lang w:val="es-ES_tradnl"/>
-        </w:rPr>
-        <w:t>llueve de octubre a abril. El volumen sube de noviembre a abril (más en enero y febrero, con un mes de retraso) y baja de junio a septiembre (máximo en julio, -77</w:t>
-      </w:r>
-      <w:r>
-        <w:t>hm³</w:t>
-      </w:r>
-      <w:r>
-        <w:t xml:space="preserve"> por semana</w:t>
-      </w:r>
-      <w:r>
-        <w:rPr>
-          <w:lang w:val="es-ES_tradnl"/>
-        </w:rPr>
-        <w:t>).</w:t>
-      </w:r>
-    </w:p>
-    <w:p>
-      <w:pPr>
-        <w:pStyle w:val="Prrafodelista"/>
-        <w:numPr>
-          <w:ilvl w:val="0"/>
-          <w:numId w:val="4"/>
-        </w:numPr>
-        <w:rPr>
-          <w:lang w:val="es-ES_tradnl"/>
-        </w:rPr>
-      </w:pPr>
-      <w:r>
-        <w:rPr>
-          <w:color w:val="0070C0"/>
-          <w:lang w:val="es-ES_tradnl"/>
-        </w:rPr>
-        <w:t xml:space="preserve">Memoria del sistema: </w:t>
-      </w:r>
-      <w:r>
-        <w:rPr>
-          <w:lang w:val="es-ES_tradnl"/>
-        </w:rPr>
-        <w:t>un año seco tras años húmedos no causa sequía (2012). Las sequias graves vienen de varios años seguidos por debajo de lo normal (2005-2009, 2017-2024).</w:t>
-      </w:r>
-    </w:p>
-    <w:p>
-      <w:pPr>
-        <w:pStyle w:val="Prrafodelista"/>
-        <w:numPr>
-          <w:ilvl w:val="0"/>
-          <w:numId w:val="4"/>
-        </w:numPr>
-        <w:rPr>
-          <w:lang w:val="es-ES_tradnl"/>
-        </w:rPr>
-      </w:pPr>
-      <w:r>
-        <w:rPr>
-          <w:color w:val="0070C0"/>
-          <w:lang w:val="es-ES_tradnl"/>
-        </w:rPr>
-        <w:t xml:space="preserve">Lluvia frente a volumen: </w:t>
-      </w:r>
-      <w:r>
-        <w:rPr>
-          <w:lang w:val="es-ES_tradnl"/>
-        </w:rPr>
-        <w:t>correlación de 0,51 a 1 semana y de 0,78 a 4 semanas la lluvia acumulada explica mucho mejor el cambio. La relación no es lineal (curva y abanico).</w:t>
-      </w:r>
-    </w:p>
-    <w:p>
-      <w:pPr>
-        <w:pStyle w:val="Prrafodelista"/>
-        <w:numPr>
-          <w:ilvl w:val="0"/>
-          <w:numId w:val="4"/>
-        </w:numPr>
-        <w:rPr>
-          <w:lang w:val="es-ES_tradnl"/>
-        </w:rPr>
-      </w:pPr>
-      <w:r>
-        <w:rPr>
-          <w:color w:val="0070C0"/>
-          <w:lang w:val="es-ES_tradnl"/>
-        </w:rPr>
-        <w:t xml:space="preserve">Retraso: </w:t>
-      </w:r>
-      <w:r>
-        <w:rPr>
-          <w:lang w:val="es-ES_tradnl"/>
-        </w:rPr>
-        <w:t xml:space="preserve">la lluvia </w:t>
-      </w:r>
-      <w:r>
-        <w:rPr>
-          <w:lang w:val="es-ES_tradnl"/>
-        </w:rPr>
-        <w:t>s</w:t>
-      </w:r>
-      <w:r>
-        <w:rPr>
-          <w:lang w:val="es-ES_tradnl"/>
-        </w:rPr>
-        <w:t>e nota sobre todo 1 semana después (0,66) y su efecto dura hasta 8 semanas (caudal base).</w:t>
-      </w:r>
-    </w:p>
-    <w:p>
-      <w:pPr>
-        <w:pStyle w:val="Prrafodelista"/>
-        <w:numPr>
-          <w:ilvl w:val="0"/>
-          <w:numId w:val="4"/>
-        </w:numPr>
-        <w:rPr>
-          <w:lang w:val="es-ES_tradnl"/>
-        </w:rPr>
-      </w:pPr>
-      <w:r>
-        <w:rPr>
-          <w:color w:val="0070C0"/>
-          <w:lang w:val="es-ES_tradnl"/>
-        </w:rPr>
-        <w:t xml:space="preserve">Suelo seco: </w:t>
-      </w:r>
-      <w:r>
-        <w:rPr>
-          <w:lang w:val="es-ES_tradnl"/>
-        </w:rPr>
-        <w:t>con la misma lluvia, en otoño el volumen sube mucho menos que en inverno (50-100 mm: +31 frente a +206</w:t>
-      </w:r>
-      <w:r>
-        <w:t>hm³</w:t>
-      </w:r>
-      <w:r>
-        <w:rPr>
-          <w:lang w:val="es-ES_tradnl"/>
-        </w:rPr>
-        <w:t>)</w:t>
-      </w:r>
-    </w:p>
-    <w:p>
-      <w:pPr>
-        <w:pStyle w:val="Prrafodelista"/>
-        <w:numPr>
-          <w:ilvl w:val="0"/>
-          <w:numId w:val="4"/>
-        </w:numPr>
-        <w:rPr>
-          <w:lang w:val="es-ES_tradnl"/>
-        </w:rPr>
-      </w:pPr>
-      <w:r>
-        <w:rPr>
-          <w:color w:val="0070C0"/>
-          <w:lang w:val="es-ES_tradnl"/>
-        </w:rPr>
-        <w:t xml:space="preserve">Temperatura: </w:t>
-      </w:r>
-      <w:r>
-        <w:rPr>
-          <w:lang w:val="es-ES_tradnl"/>
-        </w:rPr>
-        <w:t>por encima de 20 ºC el volumen baja con fuerza (riego y evaporación). Va ligada a la época del año.</w:t>
-      </w:r>
-    </w:p>
-    <w:p>
-      <w:pPr>
-        <w:rPr>
-          <w:color w:val="00B050"/>
-          <w:lang w:val="es-ES_tradnl"/>
-        </w:rPr>
-      </w:pPr>
-    </w:p>
-    <w:p>
-      <w:pPr>
-        <w:rPr>
-          <w:color w:val="00B050"/>
-          <w:lang w:val="es-ES_tradnl"/>
-        </w:rPr>
-      </w:pPr>
-      <w:r>
-        <w:rPr>
-          <w:color w:val="00B050"/>
-          <w:lang w:val="es-ES_tradnl"/>
-        </w:rPr>
-        <w:t>Variables que necesita el modelo:</w:t>
-      </w:r>
-    </w:p>
-    <w:p>
-      <w:pPr>
-        <w:pStyle w:val="Prrafodelista"/>
-        <w:numPr>
-          <w:ilvl w:val="0"/>
-          <w:numId w:val="2"/>
-        </w:numPr>
-        <w:rPr>
-          <w:lang w:val="es-ES_tradnl"/>
-        </w:rPr>
-      </w:pPr>
-      <w:r>
-        <w:rPr>
-          <w:lang w:val="es-ES_tradnl"/>
-        </w:rPr>
-        <w:t>Volumen actual y cambios de semanas anteriores (memoria).</w:t>
-      </w:r>
-    </w:p>
-    <w:p>
-      <w:pPr>
-        <w:pStyle w:val="Prrafodelista"/>
-        <w:numPr>
-          <w:ilvl w:val="0"/>
-          <w:numId w:val="2"/>
-        </w:numPr>
-        <w:rPr>
-          <w:lang w:val="es-ES_tradnl"/>
-        </w:rPr>
-      </w:pPr>
-      <w:r>
-        <w:rPr>
-          <w:lang w:val="es-ES_tradnl"/>
-        </w:rPr>
-        <w:t xml:space="preserve">Lluvia de las </w:t>
-      </w:r>
-      <w:r>
-        <w:rPr>
-          <w:lang w:val="es-ES_tradnl"/>
-        </w:rPr>
-        <w:t>últimas</w:t>
-      </w:r>
-      <w:r>
-        <w:rPr>
-          <w:lang w:val="es-ES_tradnl"/>
-        </w:rPr>
-        <w:t xml:space="preserve"> semanas y lluvia acumulada a 4, 12 y 26 semanas.</w:t>
-      </w:r>
-    </w:p>
-    <w:p>
-      <w:pPr>
-        <w:pStyle w:val="Prrafodelista"/>
-        <w:numPr>
-          <w:ilvl w:val="0"/>
-          <w:numId w:val="2"/>
-        </w:numPr>
-        <w:rPr>
-          <w:lang w:val="es-ES_tradnl"/>
-        </w:rPr>
-      </w:pPr>
-      <w:r>
-        <w:rPr>
-          <w:lang w:val="es-ES_tradnl"/>
-        </w:rPr>
-        <w:t xml:space="preserve">Lluvia acumulada desde el inicio del año </w:t>
-      </w:r>
-      <w:r>
-        <w:rPr>
-          <w:lang w:val="es-ES_tradnl"/>
-        </w:rPr>
-        <w:t>hidrológico</w:t>
-      </w:r>
-      <w:r>
-        <w:rPr>
-          <w:lang w:val="es-ES_tradnl"/>
-        </w:rPr>
-        <w:t xml:space="preserve"> (estado del suelo).</w:t>
-      </w:r>
-    </w:p>
-    <w:p>
-      <w:pPr>
-        <w:pStyle w:val="Prrafodelista"/>
-        <w:numPr>
-          <w:ilvl w:val="0"/>
-          <w:numId w:val="2"/>
-        </w:numPr>
-        <w:rPr>
-          <w:lang w:val="es-ES_tradnl"/>
-        </w:rPr>
-      </w:pPr>
-      <w:r>
-        <w:rPr>
-          <w:lang w:val="es-ES_tradnl"/>
-        </w:rPr>
-        <w:t>Semana del año o mes (estacionalidad y riego).</w:t>
-      </w:r>
-    </w:p>
-    <w:p>
-      <w:pPr>
-        <w:pStyle w:val="Prrafodelista"/>
-        <w:numPr>
-          <w:ilvl w:val="0"/>
-          <w:numId w:val="2"/>
-        </w:numPr>
-        <w:rPr>
-          <w:lang w:val="es-ES_tradnl"/>
-        </w:rPr>
-      </w:pPr>
-      <w:r>
-        <w:rPr>
-          <w:lang w:val="es-ES_tradnl"/>
-        </w:rPr>
-        <w:t>Temperatura media.</w:t>
-      </w:r>
-    </w:p>
-    <w:p>
-      <w:pPr>
-        <w:rPr>
-          <w:lang w:val="es-ES_tradnl"/>
-        </w:rPr>
-      </w:pPr>
-    </w:p>
-    <w:p>
-      <w:pPr>
-        <w:pStyle w:val="Prrafodelista"/>
-        <w:numPr>
-          <w:ilvl w:val="0"/>
-          <w:numId w:val="2"/>
-        </w:numPr>
-        <w:rPr>
-          <w:lang w:val="es-ES_tradnl"/>
-        </w:rPr>
-      </w:pPr>
+          <w:i/>
+          <w:iCs/>
+          <w:lang w:val="es-ES_tradnl"/>
+        </w:rPr>
+        <w:t>semanal.parquet</w:t>
+      </w:r>
+      <w:proofErr w:type="spellEnd"/>
+      <w:proofErr w:type="gramEnd"/>
       <w:r>
         <w:rPr>
           <w:b/>
           <w:bCs/>
+          <w:i/>
+          <w:iCs/>
+          <w:lang w:val="es-ES_tradnl"/>
+        </w:rPr>
+        <w:t>.</w:t>
+      </w:r>
+    </w:p>
+    <w:p>
+      <w:pPr>
+        <w:rPr>
+          <w:lang w:val="es-ES_tradnl"/>
+        </w:rPr>
+      </w:pPr>
+    </w:p>
+    <w:p>
+      <w:pPr>
+        <w:rPr>
+          <w:lang w:val="es-ES_tradnl"/>
+        </w:rPr>
+      </w:pPr>
+    </w:p>
+    <w:p>
+      <w:pPr>
+        <w:rPr>
+          <w:color w:val="EE0000"/>
+          <w:lang w:val="es-ES_tradnl"/>
+        </w:rPr>
+      </w:pPr>
+      <w:r>
+        <w:rPr>
+          <w:color w:val="EE0000"/>
+          <w:lang w:val="es-ES_tradnl"/>
+        </w:rPr>
+        <w:t>8. EDA</w:t>
+      </w:r>
+      <w:r>
+        <w:rPr>
+          <w:color w:val="EE0000"/>
+          <w:lang w:val="es-ES_tradnl"/>
+        </w:rPr>
+        <w:t xml:space="preserve"> (Análisis Exploratorio)</w:t>
+      </w:r>
+    </w:p>
+    <w:p>
+      <w:pPr>
+        <w:pStyle w:val="Prrafodelista"/>
+        <w:numPr>
+          <w:ilvl w:val="0"/>
+          <w:numId w:val="2"/>
+        </w:numPr>
+        <w:rPr>
+          <w:lang w:val="es-ES_tradnl"/>
+        </w:rPr>
+      </w:pPr>
+      <w:r>
+        <w:rPr>
+          <w:b/>
+          <w:bCs/>
+          <w:lang w:val="es-ES_tradnl"/>
+        </w:rPr>
+        <w:t>Qué es:</w:t>
+      </w:r>
+      <w:r>
+        <w:rPr>
+          <w:lang w:val="es-ES_tradnl"/>
+        </w:rPr>
+        <w:t xml:space="preserve"> entender cómo se comportan los datos antes de modelar, y qué variables necesitará el modelo.</w:t>
+      </w:r>
+    </w:p>
+    <w:p>
+      <w:pPr>
+        <w:rPr>
+          <w:color w:val="00B050"/>
+          <w:lang w:val="es-ES_tradnl"/>
+        </w:rPr>
+      </w:pPr>
+      <w:r>
+        <w:rPr>
+          <w:color w:val="00B050"/>
+          <w:lang w:val="es-ES_tradnl"/>
+        </w:rPr>
+        <w:t>Conclusiones:</w:t>
+      </w:r>
+    </w:p>
+    <w:p>
+      <w:pPr>
+        <w:pStyle w:val="Prrafodelista"/>
+        <w:numPr>
+          <w:ilvl w:val="0"/>
+          <w:numId w:val="4"/>
+        </w:numPr>
+        <w:rPr>
+          <w:lang w:val="es-ES_tradnl"/>
+        </w:rPr>
+      </w:pPr>
+      <w:r>
+        <w:rPr>
+          <w:color w:val="0070C0"/>
+          <w:lang w:val="es-ES_tradnl"/>
+        </w:rPr>
+        <w:t xml:space="preserve">Estacionalidad: </w:t>
+      </w:r>
+      <w:r>
+        <w:rPr>
+          <w:lang w:val="es-ES_tradnl"/>
+        </w:rPr>
+        <w:t>llueve de octubre a abril. El volumen sube de noviembre a abril (más en enero y febrero, con un mes de retraso) y baja de junio a septiembre (máximo en julio, -77</w:t>
+      </w:r>
+      <w:r>
+        <w:t>hm³ por semana</w:t>
+      </w:r>
+      <w:r>
+        <w:rPr>
+          <w:lang w:val="es-ES_tradnl"/>
+        </w:rPr>
+        <w:t>).</w:t>
+      </w:r>
+    </w:p>
+    <w:p>
+      <w:pPr>
+        <w:pStyle w:val="Prrafodelista"/>
+        <w:numPr>
+          <w:ilvl w:val="0"/>
+          <w:numId w:val="4"/>
+        </w:numPr>
+        <w:rPr>
+          <w:lang w:val="es-ES_tradnl"/>
+        </w:rPr>
+      </w:pPr>
+      <w:r>
+        <w:rPr>
+          <w:color w:val="0070C0"/>
+          <w:lang w:val="es-ES_tradnl"/>
+        </w:rPr>
+        <w:t xml:space="preserve">Memoria del sistema: </w:t>
+      </w:r>
+      <w:r>
+        <w:rPr>
+          <w:lang w:val="es-ES_tradnl"/>
+        </w:rPr>
+        <w:t>un año seco tras años húmedos no causa sequía (2012). Las sequias graves vienen de varios años seguidos por debajo de lo normal (2005-2009, 2017-2024).</w:t>
+      </w:r>
+    </w:p>
+    <w:p>
+      <w:pPr>
+        <w:pStyle w:val="Prrafodelista"/>
+        <w:numPr>
+          <w:ilvl w:val="0"/>
+          <w:numId w:val="4"/>
+        </w:numPr>
+        <w:rPr>
+          <w:lang w:val="es-ES_tradnl"/>
+        </w:rPr>
+      </w:pPr>
+      <w:r>
+        <w:rPr>
+          <w:color w:val="0070C0"/>
+          <w:lang w:val="es-ES_tradnl"/>
+        </w:rPr>
+        <w:t xml:space="preserve">Lluvia frente a volumen: </w:t>
+      </w:r>
+      <w:r>
+        <w:rPr>
+          <w:lang w:val="es-ES_tradnl"/>
+        </w:rPr>
+        <w:t>correlación de 0,51 a 1 semana y de 0,78 a 4 semanas la lluvia acumulada explica mucho mejor el cambio. La relación no es lineal (curva y abanico).</w:t>
+      </w:r>
+    </w:p>
+    <w:p>
+      <w:pPr>
+        <w:pStyle w:val="Prrafodelista"/>
+        <w:numPr>
+          <w:ilvl w:val="0"/>
+          <w:numId w:val="4"/>
+        </w:numPr>
+        <w:rPr>
+          <w:lang w:val="es-ES_tradnl"/>
+        </w:rPr>
+      </w:pPr>
+      <w:r>
+        <w:rPr>
+          <w:color w:val="0070C0"/>
+          <w:lang w:val="es-ES_tradnl"/>
+        </w:rPr>
+        <w:t xml:space="preserve">Retraso: </w:t>
+      </w:r>
+      <w:r>
+        <w:rPr>
+          <w:lang w:val="es-ES_tradnl"/>
+        </w:rPr>
+        <w:t xml:space="preserve">la lluvia </w:t>
+      </w:r>
+      <w:r>
+        <w:rPr>
+          <w:lang w:val="es-ES_tradnl"/>
+        </w:rPr>
+        <w:t>s</w:t>
+      </w:r>
+      <w:r>
+        <w:rPr>
+          <w:lang w:val="es-ES_tradnl"/>
+        </w:rPr>
+        <w:t>e nota sobre todo 1 semana después (0,66) y su efecto dura hasta 8 semanas (caudal base).</w:t>
+      </w:r>
+    </w:p>
+    <w:p>
+      <w:pPr>
+        <w:pStyle w:val="Prrafodelista"/>
+        <w:numPr>
+          <w:ilvl w:val="0"/>
+          <w:numId w:val="4"/>
+        </w:numPr>
+        <w:rPr>
+          <w:lang w:val="es-ES_tradnl"/>
+        </w:rPr>
+      </w:pPr>
+      <w:r>
+        <w:rPr>
+          <w:color w:val="0070C0"/>
+          <w:lang w:val="es-ES_tradnl"/>
+        </w:rPr>
+        <w:t xml:space="preserve">Suelo seco: </w:t>
+      </w:r>
+      <w:r>
+        <w:rPr>
+          <w:lang w:val="es-ES_tradnl"/>
+        </w:rPr>
+        <w:t>con la misma lluvia, en otoño el volumen sube mucho menos que en inverno (50-100 mm: +31 frente a +206</w:t>
+      </w:r>
+      <w:r>
+        <w:t>hm³</w:t>
+      </w:r>
+      <w:r>
+        <w:rPr>
+          <w:lang w:val="es-ES_tradnl"/>
+        </w:rPr>
+        <w:t>)</w:t>
+      </w:r>
+    </w:p>
+    <w:p>
+      <w:pPr>
+        <w:pStyle w:val="Prrafodelista"/>
+        <w:numPr>
+          <w:ilvl w:val="0"/>
+          <w:numId w:val="4"/>
+        </w:numPr>
+        <w:rPr>
+          <w:lang w:val="es-ES_tradnl"/>
+        </w:rPr>
+      </w:pPr>
+      <w:r>
+        <w:rPr>
+          <w:color w:val="0070C0"/>
+          <w:lang w:val="es-ES_tradnl"/>
+        </w:rPr>
+        <w:t xml:space="preserve">Temperatura: </w:t>
+      </w:r>
+      <w:r>
+        <w:rPr>
+          <w:lang w:val="es-ES_tradnl"/>
+        </w:rPr>
+        <w:t xml:space="preserve">por encima de 20 </w:t>
+      </w:r>
+      <w:proofErr w:type="spellStart"/>
+      <w:r>
+        <w:rPr>
+          <w:lang w:val="es-ES_tradnl"/>
+        </w:rPr>
+        <w:t>ºC</w:t>
+      </w:r>
+      <w:proofErr w:type="spellEnd"/>
+      <w:r>
+        <w:rPr>
+          <w:lang w:val="es-ES_tradnl"/>
+        </w:rPr>
+        <w:t xml:space="preserve"> el volumen baja con fuerza (riego y evaporación). Va ligada a la época del año.</w:t>
+      </w:r>
+    </w:p>
+    <w:p>
+      <w:pPr>
+        <w:rPr>
+          <w:color w:val="00B050"/>
+          <w:lang w:val="es-ES_tradnl"/>
+        </w:rPr>
+      </w:pPr>
+    </w:p>
+    <w:p>
+      <w:pPr>
+        <w:rPr>
+          <w:color w:val="00B050"/>
+          <w:lang w:val="es-ES_tradnl"/>
+        </w:rPr>
+      </w:pPr>
+      <w:r>
+        <w:rPr>
+          <w:color w:val="00B050"/>
+          <w:lang w:val="es-ES_tradnl"/>
+        </w:rPr>
+        <w:t>Variables que necesita el modelo:</w:t>
+      </w:r>
+    </w:p>
+    <w:p>
+      <w:pPr>
+        <w:pStyle w:val="Prrafodelista"/>
+        <w:numPr>
+          <w:ilvl w:val="0"/>
+          <w:numId w:val="2"/>
+        </w:numPr>
+        <w:rPr>
+          <w:lang w:val="es-ES_tradnl"/>
+        </w:rPr>
+      </w:pPr>
+      <w:r>
+        <w:rPr>
+          <w:lang w:val="es-ES_tradnl"/>
+        </w:rPr>
+        <w:t>Volumen actual y cambios de semanas anteriores (memoria).</w:t>
+      </w:r>
+    </w:p>
+    <w:p>
+      <w:pPr>
+        <w:pStyle w:val="Prrafodelista"/>
+        <w:numPr>
+          <w:ilvl w:val="0"/>
+          <w:numId w:val="2"/>
+        </w:numPr>
+        <w:rPr>
+          <w:lang w:val="es-ES_tradnl"/>
+        </w:rPr>
+      </w:pPr>
+      <w:r>
+        <w:rPr>
+          <w:lang w:val="es-ES_tradnl"/>
+        </w:rPr>
+        <w:t xml:space="preserve">Lluvia de las </w:t>
+      </w:r>
+      <w:r>
+        <w:rPr>
+          <w:lang w:val="es-ES_tradnl"/>
+        </w:rPr>
+        <w:t>últimas</w:t>
+      </w:r>
+      <w:r>
+        <w:rPr>
+          <w:lang w:val="es-ES_tradnl"/>
+        </w:rPr>
+        <w:t xml:space="preserve"> semanas y lluvia acumulada a 4, 12 y 26 semanas.</w:t>
+      </w:r>
+    </w:p>
+    <w:p>
+      <w:pPr>
+        <w:pStyle w:val="Prrafodelista"/>
+        <w:numPr>
+          <w:ilvl w:val="0"/>
+          <w:numId w:val="2"/>
+        </w:numPr>
+        <w:rPr>
+          <w:lang w:val="es-ES_tradnl"/>
+        </w:rPr>
+      </w:pPr>
+      <w:r>
+        <w:rPr>
+          <w:lang w:val="es-ES_tradnl"/>
+        </w:rPr>
+        <w:t xml:space="preserve">Lluvia acumulada desde el inicio del año </w:t>
+      </w:r>
+      <w:r>
+        <w:rPr>
+          <w:lang w:val="es-ES_tradnl"/>
+        </w:rPr>
+        <w:t>hidrológico</w:t>
+      </w:r>
+      <w:r>
+        <w:rPr>
+          <w:lang w:val="es-ES_tradnl"/>
+        </w:rPr>
+        <w:t xml:space="preserve"> (estado del suelo).</w:t>
+      </w:r>
+    </w:p>
+    <w:p>
+      <w:pPr>
+        <w:pStyle w:val="Prrafodelista"/>
+        <w:numPr>
+          <w:ilvl w:val="0"/>
+          <w:numId w:val="2"/>
+        </w:numPr>
+        <w:rPr>
+          <w:lang w:val="es-ES_tradnl"/>
+        </w:rPr>
+      </w:pPr>
+      <w:r>
+        <w:rPr>
+          <w:lang w:val="es-ES_tradnl"/>
+        </w:rPr>
+        <w:t>Semana del año o mes (estacionalidad y riego).</w:t>
+      </w:r>
+    </w:p>
+    <w:p>
+      <w:pPr>
+        <w:pStyle w:val="Prrafodelista"/>
+        <w:numPr>
+          <w:ilvl w:val="0"/>
+          <w:numId w:val="2"/>
+        </w:numPr>
+        <w:rPr>
+          <w:lang w:val="es-ES_tradnl"/>
+        </w:rPr>
+      </w:pPr>
+      <w:r>
+        <w:rPr>
+          <w:lang w:val="es-ES_tradnl"/>
+        </w:rPr>
+        <w:t>Temperatura media.</w:t>
+      </w:r>
+    </w:p>
+    <w:p>
+      <w:pPr>
+        <w:rPr>
+          <w:lang w:val="es-ES_tradnl"/>
+        </w:rPr>
+      </w:pPr>
+    </w:p>
+    <w:p>
+      <w:pPr>
+        <w:pStyle w:val="Prrafodelista"/>
+        <w:numPr>
+          <w:ilvl w:val="0"/>
+          <w:numId w:val="2"/>
+        </w:numPr>
+        <w:rPr>
+          <w:lang w:val="es-ES_tradnl"/>
+        </w:rPr>
+      </w:pPr>
+      <w:r>
+        <w:rPr>
+          <w:b/>
+          <w:bCs/>
           <w:lang w:val="es-ES_tradnl"/>
         </w:rPr>
         <w:lastRenderedPageBreak/>
@@ -2262,7 +2562,21 @@
         <w:rPr>
           <w:lang w:val="es-ES_tradnl"/>
         </w:rPr>
-        <w:t xml:space="preserve"> se espera que Random Forest y XGBoost superen la regresión lineal</w:t>
+        <w:t xml:space="preserve"> se espera que Random Forest y </w:t>
+      </w:r>
+      <w:proofErr w:type="spellStart"/>
+      <w:r>
+        <w:rPr>
+          <w:lang w:val="es-ES_tradnl"/>
+        </w:rPr>
+        <w:t>XGBoost</w:t>
+      </w:r>
+      <w:proofErr w:type="spellEnd"/>
+      <w:r>
+        <w:rPr>
+          <w:lang w:val="es-ES_tradnl"/>
+        </w:rPr>
+        <w:t xml:space="preserve"> superen la regresión lineal</w:t>
       </w:r>
       <w:r>
         <w:rPr>
@@ -2286,6 +2600,7 @@
       </w:pPr>
       <w:r>
         <w:rPr>
+          <w:noProof/>
           <w:lang w:val="es-ES_tradnl"/>
         </w:rPr>
         <w:drawing>
@@ -2336,227 +2651,50 @@
     <w:p>
       <w:pPr>
         <w:rPr>
-          <w:lang w:val="es-ES_tradnl"/>
-        </w:rPr>
-      </w:pPr>
-    </w:p>
-    <w:p>
-      <w:pPr>
-        <w:rPr>
-          <w:lang w:val="es-ES_tradnl"/>
-        </w:rPr>
-      </w:pPr>
-    </w:p>
-    <w:p>
-      <w:pPr>
-        <w:rPr>
-          <w:lang w:val="es-ES_tradnl"/>
-        </w:rPr>
-      </w:pPr>
-    </w:p>
-    <w:p>
-      <w:pPr>
-        <w:rPr>
-          <w:lang w:val="es-ES_tradnl"/>
-        </w:rPr>
-      </w:pPr>
-    </w:p>
-    <w:p>
-      <w:pPr>
-        <w:rPr>
-          <w:lang w:val="es-ES_tradnl"/>
-        </w:rPr>
-      </w:pPr>
-    </w:p>
-    <w:p>
-      <w:pPr>
-        <w:rPr>
-          <w:lang w:val="es-ES_tradnl"/>
-        </w:rPr>
-      </w:pPr>
-    </w:p>
-    <w:p>
-      <w:pPr>
-        <w:rPr>
-          <w:lang w:val="es-ES_tradnl"/>
-        </w:rPr>
-      </w:pPr>
-    </w:p>
-    <w:p>
-      <w:pPr>
-        <w:rPr>
-          <w:lang w:val="es-ES_tradnl"/>
-        </w:rPr>
-      </w:pPr>
-    </w:p>
-    <w:p>
-      <w:pPr>
-        <w:rPr>
-          <w:lang w:val="es-ES_tradnl"/>
-        </w:rPr>
-      </w:pPr>
-    </w:p>
-    <w:p>
-      <w:pPr>
-        <w:rPr>
-          <w:lang w:val="es-ES_tradnl"/>
-        </w:rPr>
-      </w:pPr>
-    </w:p>
-    <w:p>
-      <w:pPr>
-        <w:rPr>
-          <w:lang w:val="es-ES_tradnl"/>
-        </w:rPr>
-      </w:pPr>
-    </w:p>
-    <w:p>
-      <w:pPr>
-        <w:rPr>
-          <w:lang w:val="es-ES_tradnl"/>
-        </w:rPr>
-      </w:pPr>
-    </w:p>
-    <w:p>
-      <w:pPr>
-        <w:rPr>
-          <w:lang w:val="es-ES_tradnl"/>
-        </w:rPr>
-      </w:pPr>
-    </w:p>
-    <w:p>
-      <w:pPr>
-        <w:rPr>
-          <w:lang w:val="es-ES_tradnl"/>
-        </w:rPr>
-      </w:pPr>
-    </w:p>
-    <w:p>
-      <w:pPr>
-        <w:rPr>
-          <w:lang w:val="es-ES_tradnl"/>
-        </w:rPr>
-      </w:pPr>
-    </w:p>
-    <w:p>
-      <w:pPr>
-        <w:rPr>
-          <w:lang w:val="es-ES_tradnl"/>
-        </w:rPr>
-      </w:pPr>
-    </w:p>
-    <w:p>
-      <w:pPr>
-        <w:rPr>
-          <w:lang w:val="es-ES_tradnl"/>
-        </w:rPr>
-      </w:pPr>
-    </w:p>
-    <w:p>
-      <w:pPr>
-        <w:rPr>
-          <w:lang w:val="es-ES_tradnl"/>
-        </w:rPr>
-      </w:pPr>
-    </w:p>
-    <w:p>
-      <w:pPr>
-        <w:rPr>
-          <w:lang w:val="es-ES_tradnl"/>
-        </w:rPr>
-      </w:pPr>
-    </w:p>
-    <w:p>
-      <w:pPr>
-        <w:rPr>
-          <w:lang w:val="es-ES_tradnl"/>
-        </w:rPr>
-      </w:pPr>
-    </w:p>
-    <w:p>
-      <w:pPr>
-        <w:rPr>
-          <w:lang w:val="es-ES_tradnl"/>
-        </w:rPr>
-      </w:pPr>
-    </w:p>
-    <w:p>
-      <w:pPr>
-        <w:rPr>
-          <w:lang w:val="es-ES_tradnl"/>
-        </w:rPr>
-      </w:pPr>
-    </w:p>
-    <w:p>
-      <w:pPr>
-        <w:rPr>
-          <w:lang w:val="es-ES_tradnl"/>
-        </w:rPr>
-      </w:pPr>
-    </w:p>
-    <w:p>
-      <w:pPr>
-        <w:rPr>
-          <w:lang w:val="es-ES_tradnl"/>
-        </w:rPr>
-      </w:pPr>
-    </w:p>
-    <w:p>
-      <w:pPr>
-        <w:rPr>
-          <w:lang w:val="es-ES_tradnl"/>
-        </w:rPr>
-      </w:pPr>
-    </w:p>
-    <w:p>
-      <w:pPr>
-        <w:rPr>
-          <w:lang w:val="es-ES_tradnl"/>
-        </w:rPr>
-      </w:pPr>
-    </w:p>
-    <w:p>
-      <w:pPr>
-        <w:rPr>
-          <w:lang w:val="es-ES_tradnl"/>
-        </w:rPr>
-      </w:pPr>
-    </w:p>
-    <w:p>
-      <w:pPr>
-        <w:rPr>
-          <w:lang w:val="es-ES_tradnl"/>
-        </w:rPr>
-      </w:pPr>
-    </w:p>
-    <w:p>
-      <w:pPr>
-        <w:rPr>
-          <w:lang w:val="es-ES_tradnl"/>
-        </w:rPr>
-      </w:pPr>
-    </w:p>
-    <w:p>
-      <w:pPr>
-        <w:rPr>
-          <w:lang w:val="es-ES_tradnl"/>
-        </w:rPr>
-      </w:pPr>
-    </w:p>
-    <w:p>
-      <w:pPr>
-        <w:rPr>
           <w:color w:val="EE0000"/>
           <w:lang w:val="es-ES_tradnl"/>
         </w:rPr>
       </w:pPr>
-      <w:r>
+    </w:p>
+    <w:p>
+      <w:pPr>
         <w:rPr>
           <w:color w:val="EE0000"/>
           <w:lang w:val="es-ES_tradnl"/>
         </w:rPr>
-        <w:t>Conceptos nuevos/repaso:</w:t>
-      </w:r>
+      </w:pPr>
+      <w:r>
+        <w:rPr>
+          <w:color w:val="EE0000"/>
+          <w:lang w:val="es-ES_tradnl"/>
+        </w:rPr>
+        <w:t xml:space="preserve">9. </w:t>
+      </w:r>
+      <w:proofErr w:type="spellStart"/>
+      <w:r>
+        <w:rPr>
+          <w:color w:val="EE0000"/>
+          <w:lang w:val="es-ES_tradnl"/>
+        </w:rPr>
+        <w:t>Feature</w:t>
+      </w:r>
+      <w:proofErr w:type="spellEnd"/>
+      <w:r>
+        <w:rPr>
+          <w:color w:val="EE0000"/>
+          <w:lang w:val="es-ES_tradnl"/>
+        </w:rPr>
+        <w:t xml:space="preserve"> </w:t>
+      </w:r>
+      <w:proofErr w:type="spellStart"/>
+      <w:r>
+        <w:rPr>
+          <w:color w:val="EE0000"/>
+          <w:lang w:val="es-ES_tradnl"/>
+        </w:rPr>
+        <w:t>engineering</w:t>
+      </w:r>
+      <w:proofErr w:type="spellEnd"/>
     </w:p>
     <w:p>
       <w:pPr>
@@ -2575,20 +2713,69 @@
           <w:bCs/>
           <w:lang w:val="es-ES_tradnl"/>
         </w:rPr>
-        <w:t>Parquet:</w:t>
-      </w:r>
-      <w:r>
-        <w:rPr>
-          <w:lang w:val="es-ES_tradnl"/>
-        </w:rPr>
-        <w:t xml:space="preserve"> formato de tabla comprimido que guarda los tipos de cada columna. Es el estándar para datos procesados.</w:t>
-      </w:r>
-    </w:p>
-    <w:p>
-      <w:pPr>
-        <w:pStyle w:val="Prrafodelista"/>
-        <w:numPr>
-          <w:ilvl w:val="0"/>
+        <w:t>Qué es:</w:t>
+      </w:r>
+      <w:r>
+        <w:rPr>
+          <w:lang w:val="es-ES_tradnl"/>
+        </w:rPr>
+        <w:t xml:space="preserve"> crear las variables que usará el modelo. Como Random Forest y </w:t>
+      </w:r>
+      <w:proofErr w:type="spellStart"/>
+      <w:r>
+        <w:rPr>
+          <w:lang w:val="es-ES_tradnl"/>
+        </w:rPr>
+        <w:t>XGBoost</w:t>
+      </w:r>
+      <w:proofErr w:type="spellEnd"/>
+      <w:r>
+        <w:rPr>
+          <w:lang w:val="es-ES_tradnl"/>
+        </w:rPr>
+        <w:t xml:space="preserve"> no tienen memoria, cada semana lleva su pasada como columnas.</w:t>
+      </w:r>
+    </w:p>
+    <w:p>
+      <w:pPr>
+        <w:rPr>
+          <w:color w:val="00B050"/>
+          <w:lang w:val="es-ES_tradnl"/>
+        </w:rPr>
+      </w:pPr>
+      <w:r>
+        <w:rPr>
+          <w:color w:val="00B050"/>
+          <w:lang w:val="es-ES_tradnl"/>
+        </w:rPr>
+        <w:t>Variables</w:t>
+      </w:r>
+    </w:p>
+    <w:p>
+      <w:pPr>
+        <w:pStyle w:val="Prrafodelista"/>
+        <w:numPr>
+          <w:ilvl w:val="0"/>
+          <w:numId w:val="2"/>
+        </w:numPr>
+        <w:rPr>
+          <w:color w:val="0070C0"/>
+          <w:lang w:val="es-ES_tradnl"/>
+        </w:rPr>
+      </w:pPr>
+      <w:r>
+        <w:rPr>
+          <w:color w:val="0070C0"/>
+          <w:lang w:val="es-ES_tradnl"/>
+        </w:rPr>
+        <w:t>Memoria del embalse:</w:t>
+      </w:r>
+    </w:p>
+    <w:p>
+      <w:pPr>
+        <w:pStyle w:val="Prrafodelista"/>
+        <w:numPr>
+          <w:ilvl w:val="1"/>
           <w:numId w:val="2"/>
         </w:numPr>
         <w:rPr>
@@ -2599,70 +2786,1064 @@
         <w:rPr>
           <w:b/>
           <w:bCs/>
-          <w:lang w:val="es-ES_tradnl"/>
-        </w:rPr>
-        <w:t>Data leakage temporal:</w:t>
-      </w:r>
-      <w:r>
-        <w:rPr>
-          <w:lang w:val="es-ES_tradnl"/>
-        </w:rPr>
-        <w:t xml:space="preserve"> usar información posterior al momento de la predicción. Se evita usando solo datos hasta la fecha de cada fila.</w:t>
-      </w:r>
-    </w:p>
-    <w:p>
-      <w:pPr>
-        <w:pStyle w:val="Prrafodelista"/>
-        <w:numPr>
-          <w:ilvl w:val="0"/>
-          <w:numId w:val="2"/>
-        </w:numPr>
-        <w:rPr>
-          <w:lang w:val="es-ES_tradnl"/>
-        </w:rPr>
-      </w:pPr>
+          <w:i/>
+          <w:iCs/>
+          <w:lang w:val="es-ES_tradnl"/>
+        </w:rPr>
+        <w:t>volumen:</w:t>
+      </w:r>
+      <w:r>
+        <w:rPr>
+          <w:lang w:val="es-ES_tradnl"/>
+        </w:rPr>
+        <w:t xml:space="preserve"> cuánta agua hay hoy. Es el punto de partida, un embalse casi lleno no puede subir mucho y uno casi vacío no puede bajar mucho.</w:t>
+      </w:r>
+    </w:p>
+    <w:p>
+      <w:pPr>
+        <w:pStyle w:val="Prrafodelista"/>
+        <w:numPr>
+          <w:ilvl w:val="1"/>
+          <w:numId w:val="2"/>
+        </w:numPr>
+        <w:rPr>
+          <w:lang w:val="es-ES_tradnl"/>
+        </w:rPr>
+      </w:pPr>
+      <w:proofErr w:type="spellStart"/>
       <w:r>
         <w:rPr>
           <w:b/>
           <w:bCs/>
-          <w:lang w:val="es-ES_tradnl"/>
-        </w:rPr>
-        <w:t>Feature engineering:</w:t>
-      </w:r>
-      <w:r>
-        <w:rPr>
-          <w:lang w:val="es-ES_tradnl"/>
-        </w:rPr>
-        <w:t xml:space="preserve"> crear variables a partir de los datos para que el modelo pueda aprender. En series temporales, cada fila debe llevar su pasado como columnas (lags y acumulados).</w:t>
-      </w:r>
-    </w:p>
-    <w:p>
-      <w:pPr>
-        <w:pStyle w:val="Prrafodelista"/>
-        <w:numPr>
-          <w:ilvl w:val="0"/>
-          <w:numId w:val="2"/>
-        </w:numPr>
-        <w:rPr>
-          <w:lang w:val="es-ES_tradnl"/>
-        </w:rPr>
-      </w:pPr>
+          <w:i/>
+          <w:iCs/>
+          <w:lang w:val="es-ES_tradnl"/>
+        </w:rPr>
+        <w:t>pct_llenado</w:t>
+      </w:r>
+      <w:proofErr w:type="spellEnd"/>
       <w:r>
         <w:rPr>
           <w:b/>
           <w:bCs/>
-          <w:lang w:val="es-ES_tradnl"/>
-        </w:rPr>
-        <w:t>La</w:t>
-      </w:r>
+          <w:i/>
+          <w:iCs/>
+          <w:lang w:val="es-ES_tradnl"/>
+        </w:rPr>
+        <w:t>:</w:t>
+      </w:r>
+      <w:r>
+        <w:rPr>
+          <w:lang w:val="es-ES_tradnl"/>
+        </w:rPr>
+        <w:t xml:space="preserve"> lo mismo, pero en %. Ayuda a saber si está cerca del máximo.</w:t>
+      </w:r>
+    </w:p>
+    <w:p>
+      <w:pPr>
+        <w:pStyle w:val="Prrafodelista"/>
+        <w:numPr>
+          <w:ilvl w:val="1"/>
+          <w:numId w:val="2"/>
+        </w:numPr>
+        <w:rPr>
+          <w:lang w:val="es-ES_tradnl"/>
+        </w:rPr>
+      </w:pPr>
+      <w:proofErr w:type="spellStart"/>
       <w:r>
         <w:rPr>
           <w:b/>
           <w:bCs/>
+          <w:i/>
+          <w:iCs/>
+          <w:lang w:val="es-ES_tradnl"/>
+        </w:rPr>
+        <w:t>cambio_ls</w:t>
+      </w:r>
+      <w:proofErr w:type="spellEnd"/>
+      <w:r>
+        <w:rPr>
+          <w:b/>
+          <w:bCs/>
+          <w:i/>
+          <w:iCs/>
+          <w:lang w:val="es-ES_tradnl"/>
+        </w:rPr>
+        <w:t>:</w:t>
+      </w:r>
+      <w:r>
+        <w:rPr>
+          <w:lang w:val="es-ES_tradnl"/>
+        </w:rPr>
+        <w:t xml:space="preserve"> cuánto subió o bajó la última semana. Si viene subiendo, probablemente siga subiendo (inercia).</w:t>
+      </w:r>
+    </w:p>
+    <w:p>
+      <w:pPr>
+        <w:pStyle w:val="Prrafodelista"/>
+        <w:numPr>
+          <w:ilvl w:val="1"/>
+          <w:numId w:val="2"/>
+        </w:numPr>
+        <w:rPr>
+          <w:lang w:val="es-ES_tradnl"/>
+        </w:rPr>
+      </w:pPr>
+      <w:r>
+        <w:rPr>
+          <w:b/>
+          <w:bCs/>
+          <w:i/>
+          <w:iCs/>
+          <w:lang w:val="es-ES_tradnl"/>
+        </w:rPr>
+        <w:t>cambio_4s:</w:t>
+      </w:r>
+      <w:r>
+        <w:rPr>
+          <w:lang w:val="es-ES_tradnl"/>
+        </w:rPr>
+        <w:t xml:space="preserve"> lo mismo en el último mes. De la tendencia más estable.</w:t>
+      </w:r>
+    </w:p>
+    <w:p>
+      <w:pPr>
+        <w:rPr>
+          <w:lang w:val="es-ES_tradnl"/>
+        </w:rPr>
+      </w:pPr>
+    </w:p>
+    <w:p>
+      <w:pPr>
+        <w:pStyle w:val="Prrafodelista"/>
+        <w:numPr>
+          <w:ilvl w:val="0"/>
+          <w:numId w:val="2"/>
+        </w:numPr>
+        <w:rPr>
+          <w:color w:val="0070C0"/>
+          <w:lang w:val="es-ES_tradnl"/>
+        </w:rPr>
+      </w:pPr>
+      <w:r>
+        <w:rPr>
+          <w:color w:val="0070C0"/>
+          <w:lang w:val="es-ES_tradnl"/>
+        </w:rPr>
+        <w:lastRenderedPageBreak/>
+        <w:t>Lluvia:</w:t>
+      </w:r>
+    </w:p>
+    <w:p>
+      <w:pPr>
+        <w:pStyle w:val="Prrafodelista"/>
+        <w:numPr>
+          <w:ilvl w:val="1"/>
+          <w:numId w:val="2"/>
+        </w:numPr>
+        <w:rPr>
+          <w:lang w:val="es-ES_tradnl"/>
+        </w:rPr>
+      </w:pPr>
+      <w:r>
+        <w:rPr>
+          <w:b/>
+          <w:bCs/>
+          <w:i/>
+          <w:iCs/>
+          <w:lang w:val="es-ES_tradnl"/>
+        </w:rPr>
+        <w:t>lluvia:</w:t>
+      </w:r>
+      <w:r>
+        <w:rPr>
+          <w:lang w:val="es-ES_tradnl"/>
+        </w:rPr>
+        <w:t xml:space="preserve"> lo que ha llovido esa semana.</w:t>
+      </w:r>
+    </w:p>
+    <w:p>
+      <w:pPr>
+        <w:pStyle w:val="Prrafodelista"/>
+        <w:numPr>
+          <w:ilvl w:val="1"/>
+          <w:numId w:val="2"/>
+        </w:numPr>
+        <w:rPr>
+          <w:lang w:val="es-ES_tradnl"/>
+        </w:rPr>
+      </w:pPr>
+      <w:r>
+        <w:rPr>
+          <w:b/>
+          <w:bCs/>
+          <w:i/>
+          <w:iCs/>
+          <w:lang w:val="es-ES_tradnl"/>
+        </w:rPr>
+        <w:t>lluvia_lag1:</w:t>
+      </w:r>
+      <w:r>
+        <w:rPr>
+          <w:lang w:val="es-ES_tradnl"/>
+        </w:rPr>
+        <w:t xml:space="preserve"> lo que llovió la semana pasada. Es el más se nota ahora, porque el agua tarda en llegar una semana.</w:t>
+      </w:r>
+    </w:p>
+    <w:p>
+      <w:pPr>
+        <w:pStyle w:val="Prrafodelista"/>
+        <w:numPr>
+          <w:ilvl w:val="1"/>
+          <w:numId w:val="2"/>
+        </w:numPr>
+        <w:rPr>
+          <w:lang w:val="es-ES_tradnl"/>
+        </w:rPr>
+      </w:pPr>
+      <w:r>
+        <w:rPr>
+          <w:b/>
+          <w:bCs/>
+          <w:i/>
+          <w:iCs/>
+          <w:lang w:val="es-ES_tradnl"/>
+        </w:rPr>
+        <w:t>lluvia_4s:</w:t>
+      </w:r>
+      <w:r>
+        <w:rPr>
+          <w:lang w:val="es-ES_tradnl"/>
+        </w:rPr>
+        <w:t xml:space="preserve"> lluvia del último mes. Es el agua que está llegando de los embalses.</w:t>
+      </w:r>
+    </w:p>
+    <w:p>
+      <w:pPr>
+        <w:pStyle w:val="Prrafodelista"/>
+        <w:numPr>
+          <w:ilvl w:val="1"/>
+          <w:numId w:val="2"/>
+        </w:numPr>
+        <w:rPr>
+          <w:lang w:val="es-ES_tradnl"/>
+        </w:rPr>
+      </w:pPr>
+      <w:r>
+        <w:rPr>
+          <w:b/>
+          <w:bCs/>
+          <w:i/>
+          <w:iCs/>
+          <w:lang w:val="es-ES_tradnl"/>
+        </w:rPr>
+        <w:t>lluvia_12s:</w:t>
+      </w:r>
+      <w:r>
+        <w:rPr>
+          <w:lang w:val="es-ES_tradnl"/>
+        </w:rPr>
+        <w:t xml:space="preserve"> lluvia de los últimos 3 meses. Indica si estamos en una temporada húmeda o seca.</w:t>
+      </w:r>
+    </w:p>
+    <w:p>
+      <w:pPr>
+        <w:pStyle w:val="Prrafodelista"/>
+        <w:numPr>
+          <w:ilvl w:val="1"/>
+          <w:numId w:val="2"/>
+        </w:numPr>
+        <w:rPr>
+          <w:lang w:val="es-ES_tradnl"/>
+        </w:rPr>
+      </w:pPr>
+      <w:r>
+        <w:rPr>
+          <w:b/>
+          <w:bCs/>
+          <w:i/>
+          <w:iCs/>
+          <w:lang w:val="es-ES_tradnl"/>
+        </w:rPr>
+        <w:t>lluvia_26s</w:t>
+      </w:r>
+      <w:r>
+        <w:rPr>
+          <w:lang w:val="es-ES_tradnl"/>
+        </w:rPr>
+        <w:t xml:space="preserve">: lluvia de los últimos 6 meses. Es la memoria a largo plazo (acuíferos y caudal base). </w:t>
+      </w:r>
+    </w:p>
+    <w:p>
+      <w:pPr>
+        <w:pStyle w:val="Prrafodelista"/>
+        <w:rPr>
+          <w:lang w:val="es-ES_tradnl"/>
+        </w:rPr>
+      </w:pPr>
+    </w:p>
+    <w:p>
+      <w:pPr>
+        <w:pStyle w:val="Prrafodelista"/>
+        <w:numPr>
+          <w:ilvl w:val="0"/>
+          <w:numId w:val="2"/>
+        </w:numPr>
+        <w:rPr>
+          <w:color w:val="0070C0"/>
+          <w:lang w:val="es-ES_tradnl"/>
+        </w:rPr>
+      </w:pPr>
+      <w:r>
+        <w:rPr>
+          <w:color w:val="0070C0"/>
+          <w:lang w:val="es-ES_tradnl"/>
+        </w:rPr>
+        <w:t xml:space="preserve">Suelo: </w:t>
+      </w:r>
+    </w:p>
+    <w:p>
+      <w:pPr>
+        <w:pStyle w:val="Prrafodelista"/>
+        <w:numPr>
+          <w:ilvl w:val="1"/>
+          <w:numId w:val="2"/>
+        </w:numPr>
+        <w:rPr>
+          <w:lang w:val="es-ES_tradnl"/>
+        </w:rPr>
+      </w:pPr>
+      <w:proofErr w:type="spellStart"/>
+      <w:r>
+        <w:rPr>
+          <w:b/>
+          <w:bCs/>
+          <w:i/>
+          <w:iCs/>
+          <w:lang w:val="es-ES_tradnl"/>
+        </w:rPr>
+        <w:t>lluvia_año_hidro</w:t>
+      </w:r>
+      <w:proofErr w:type="spellEnd"/>
+      <w:r>
+        <w:rPr>
+          <w:b/>
+          <w:bCs/>
+          <w:i/>
+          <w:iCs/>
+          <w:lang w:val="es-ES_tradnl"/>
+        </w:rPr>
+        <w:t>:</w:t>
+      </w:r>
+      <w:r>
+        <w:rPr>
+          <w:lang w:val="es-ES_tradnl"/>
+        </w:rPr>
+        <w:t xml:space="preserve"> lluvia desde el 1 de octubre. Si es baja, el suelo esta seco y absorberá la próxima lluvia; si es alta, la lluvia correrá a los ríos.</w:t>
+      </w:r>
+    </w:p>
+    <w:p>
+      <w:pPr>
+        <w:pStyle w:val="Prrafodelista"/>
+        <w:ind w:left="1440"/>
+        <w:rPr>
+          <w:lang w:val="es-ES_tradnl"/>
+        </w:rPr>
+      </w:pPr>
+    </w:p>
+    <w:p>
+      <w:pPr>
+        <w:pStyle w:val="Prrafodelista"/>
+        <w:numPr>
+          <w:ilvl w:val="0"/>
+          <w:numId w:val="2"/>
+        </w:numPr>
+        <w:rPr>
+          <w:color w:val="0070C0"/>
+          <w:lang w:val="es-ES_tradnl"/>
+        </w:rPr>
+      </w:pPr>
+      <w:r>
+        <w:rPr>
+          <w:color w:val="0070C0"/>
+          <w:lang w:val="es-ES_tradnl"/>
+        </w:rPr>
+        <w:t>Estacionalidad:</w:t>
+      </w:r>
+    </w:p>
+    <w:p>
+      <w:pPr>
+        <w:pStyle w:val="Prrafodelista"/>
+        <w:numPr>
+          <w:ilvl w:val="1"/>
+          <w:numId w:val="2"/>
+        </w:numPr>
+        <w:rPr>
+          <w:lang w:val="es-ES_tradnl"/>
+        </w:rPr>
+      </w:pPr>
+      <w:r>
+        <w:rPr>
+          <w:b/>
+          <w:bCs/>
+          <w:i/>
+          <w:iCs/>
+          <w:lang w:val="es-ES_tradnl"/>
+        </w:rPr>
+        <w:t>semana:</w:t>
+      </w:r>
+      <w:r>
+        <w:rPr>
+          <w:lang w:val="es-ES_tradnl"/>
+        </w:rPr>
+        <w:t xml:space="preserve"> en qué momento del año estamos. Le dice al modelo si es época de llenado (invierno) o de riego (verano).</w:t>
+      </w:r>
+    </w:p>
+    <w:p>
+      <w:pPr>
+        <w:pStyle w:val="Prrafodelista"/>
+        <w:ind w:left="1440"/>
+        <w:rPr>
+          <w:lang w:val="es-ES_tradnl"/>
+        </w:rPr>
+      </w:pPr>
+    </w:p>
+    <w:p>
+      <w:pPr>
+        <w:pStyle w:val="Prrafodelista"/>
+        <w:numPr>
+          <w:ilvl w:val="0"/>
+          <w:numId w:val="2"/>
+        </w:numPr>
+        <w:rPr>
+          <w:color w:val="0070C0"/>
+          <w:lang w:val="es-ES_tradnl"/>
+        </w:rPr>
+      </w:pPr>
+      <w:r>
+        <w:rPr>
+          <w:color w:val="0070C0"/>
+          <w:lang w:val="es-ES_tradnl"/>
+        </w:rPr>
+        <w:t>Calor:</w:t>
+      </w:r>
+    </w:p>
+    <w:p>
+      <w:pPr>
+        <w:pStyle w:val="Prrafodelista"/>
+        <w:numPr>
+          <w:ilvl w:val="1"/>
+          <w:numId w:val="2"/>
+        </w:numPr>
+        <w:rPr>
+          <w:lang w:val="es-ES_tradnl"/>
+        </w:rPr>
+      </w:pPr>
+      <w:proofErr w:type="spellStart"/>
+      <w:r>
+        <w:rPr>
+          <w:b/>
+          <w:bCs/>
+          <w:i/>
+          <w:iCs/>
+          <w:lang w:val="es-ES_tradnl"/>
+        </w:rPr>
+        <w:t>tmed</w:t>
+      </w:r>
+      <w:proofErr w:type="spellEnd"/>
+      <w:r>
+        <w:rPr>
+          <w:b/>
+          <w:bCs/>
+          <w:i/>
+          <w:iCs/>
+          <w:lang w:val="es-ES_tradnl"/>
+        </w:rPr>
+        <w:t>:</w:t>
+      </w:r>
+      <w:r>
+        <w:rPr>
+          <w:lang w:val="es-ES_tradnl"/>
+        </w:rPr>
+        <w:t xml:space="preserve"> temperatura de esta semana.</w:t>
+      </w:r>
+    </w:p>
+    <w:p>
+      <w:pPr>
+        <w:pStyle w:val="Prrafodelista"/>
+        <w:numPr>
+          <w:ilvl w:val="1"/>
+          <w:numId w:val="2"/>
+        </w:numPr>
+        <w:rPr>
+          <w:lang w:val="es-ES_tradnl"/>
+        </w:rPr>
+      </w:pPr>
+      <w:r>
+        <w:rPr>
+          <w:b/>
+          <w:bCs/>
+          <w:i/>
+          <w:iCs/>
+          <w:lang w:val="es-ES_tradnl"/>
+        </w:rPr>
+        <w:t>tmed_4s:</w:t>
+      </w:r>
+      <w:r>
+        <w:rPr>
+          <w:lang w:val="es-ES_tradnl"/>
+        </w:rPr>
+        <w:t xml:space="preserve"> temperatura media del último mes. Mas calor significa más evaporación y más riego. </w:t>
+      </w:r>
+    </w:p>
+    <w:p>
+      <w:pPr>
+        <w:rPr>
+          <w:color w:val="00B050"/>
+          <w:lang w:val="es-ES_tradnl"/>
+        </w:rPr>
+      </w:pPr>
+      <w:r>
+        <w:rPr>
+          <w:color w:val="00B050"/>
+          <w:lang w:val="es-ES_tradnl"/>
+        </w:rPr>
+        <w:t>Objetivos</w:t>
+      </w:r>
+    </w:p>
+    <w:p>
+      <w:pPr>
+        <w:pStyle w:val="Prrafodelista"/>
+        <w:numPr>
+          <w:ilvl w:val="0"/>
+          <w:numId w:val="2"/>
+        </w:numPr>
+        <w:rPr>
+          <w:lang w:val="es-ES_tradnl"/>
+        </w:rPr>
+      </w:pPr>
+      <w:r>
+        <w:rPr>
+          <w:b/>
+          <w:bCs/>
+          <w:i/>
+          <w:iCs/>
+          <w:lang w:val="es-ES_tradnl"/>
+        </w:rPr>
+        <w:t>objetivo_4s</w:t>
+      </w:r>
+      <w:r>
+        <w:rPr>
+          <w:lang w:val="es-ES_tradnl"/>
+        </w:rPr>
+        <w:t xml:space="preserve"> = volumen dentro de 4 semanas – volumen de hoy </w:t>
+      </w:r>
+      <w:r>
+        <w:t>(</w:t>
+      </w:r>
+      <w:proofErr w:type="gramStart"/>
+      <w:r>
+        <w:rPr>
+          <w:rStyle w:val="CdigoHTML"/>
+          <w:rFonts w:eastAsiaTheme="minorHAnsi"/>
+        </w:rPr>
+        <w:t>shift(</w:t>
+      </w:r>
+      <w:proofErr w:type="gramEnd"/>
+      <w:r>
+        <w:rPr>
+          <w:rStyle w:val="CdigoHTML"/>
+          <w:rFonts w:eastAsiaTheme="minorHAnsi"/>
+        </w:rPr>
+        <w:t>-4)</w:t>
+      </w:r>
+      <w:r>
+        <w:t>).</w:t>
+      </w:r>
+      <w:r>
+        <w:t xml:space="preserve"> Lo mismo con 8 semanas.</w:t>
+      </w:r>
+    </w:p>
+    <w:p>
+      <w:pPr>
+        <w:pStyle w:val="Prrafodelista"/>
+        <w:numPr>
+          <w:ilvl w:val="0"/>
+          <w:numId w:val="2"/>
+        </w:numPr>
+        <w:rPr>
+          <w:lang w:val="es-ES_tradnl"/>
+        </w:rPr>
+      </w:pPr>
+      <w:r>
+        <w:t xml:space="preserve">Las ultimas 4 u 8 semanas no tiene objetivo </w:t>
+      </w:r>
+      <w:r>
+        <w:sym w:font="Wingdings" w:char="F0E0"/>
+      </w:r>
+      <w:r>
+        <w:t xml:space="preserve"> no se entrenan con ellas, pero son las que se usan para predecir.</w:t>
+      </w:r>
+    </w:p>
+    <w:p>
+      <w:pPr>
+        <w:rPr>
+          <w:color w:val="00B050"/>
+          <w:lang w:val="es-ES_tradnl"/>
+        </w:rPr>
+      </w:pPr>
+      <w:r>
+        <w:rPr>
+          <w:color w:val="00B050"/>
+          <w:lang w:val="es-ES_tradnl"/>
+        </w:rPr>
+        <w:t>Reglas</w:t>
+      </w:r>
+    </w:p>
+    <w:p>
+      <w:pPr>
+        <w:pStyle w:val="Prrafodelista"/>
+        <w:numPr>
+          <w:ilvl w:val="0"/>
+          <w:numId w:val="2"/>
+        </w:numPr>
+        <w:rPr>
+          <w:lang w:val="es-ES_tradnl"/>
+        </w:rPr>
+      </w:pPr>
+      <w:r>
+        <w:rPr>
+          <w:lang w:val="es-ES_tradnl"/>
+        </w:rPr>
+        <w:t xml:space="preserve">Ninguna variable usa datos posteriores a la fecha de la fila (sin </w:t>
+      </w:r>
+      <w:proofErr w:type="spellStart"/>
+      <w:r>
+        <w:rPr>
+          <w:lang w:val="es-ES_tradnl"/>
+        </w:rPr>
+        <w:t>dataleakage</w:t>
+      </w:r>
+      <w:proofErr w:type="spellEnd"/>
+      <w:r>
+        <w:rPr>
+          <w:lang w:val="es-ES_tradnl"/>
+        </w:rPr>
+        <w:t>).</w:t>
+      </w:r>
+    </w:p>
+    <w:p>
+      <w:pPr>
+        <w:pStyle w:val="Prrafodelista"/>
+        <w:numPr>
+          <w:ilvl w:val="0"/>
+          <w:numId w:val="2"/>
+        </w:numPr>
+        <w:rPr>
+          <w:lang w:val="es-ES_tradnl"/>
+        </w:rPr>
+      </w:pPr>
+      <w:r>
+        <w:rPr>
+          <w:lang w:val="es-ES_tradnl"/>
+        </w:rPr>
+        <w:t>Las acumuladas usan la lluvia de 1993 para tener valor desde la primera semana de 1994.</w:t>
+      </w:r>
+    </w:p>
+    <w:p>
+      <w:pPr>
+        <w:rPr>
+          <w:lang w:val="es-ES_tradnl"/>
+        </w:rPr>
+      </w:pPr>
+    </w:p>
+    <w:p>
+      <w:pPr>
+        <w:rPr>
+          <w:lang w:val="es-ES_tradnl"/>
+        </w:rPr>
+      </w:pPr>
+    </w:p>
+    <w:p>
+      <w:pPr>
+        <w:rPr>
+          <w:lang w:val="es-ES_tradnl"/>
+        </w:rPr>
+      </w:pPr>
+    </w:p>
+    <w:p>
+      <w:pPr>
+        <w:rPr>
+          <w:lang w:val="es-ES_tradnl"/>
+        </w:rPr>
+      </w:pPr>
+    </w:p>
+    <w:p>
+      <w:pPr>
+        <w:rPr>
+          <w:lang w:val="es-ES_tradnl"/>
+        </w:rPr>
+      </w:pPr>
+    </w:p>
+    <w:p>
+      <w:pPr>
+        <w:rPr>
+          <w:lang w:val="es-ES_tradnl"/>
+        </w:rPr>
+      </w:pPr>
+    </w:p>
+    <w:p>
+      <w:pPr>
+        <w:rPr>
+          <w:lang w:val="es-ES_tradnl"/>
+        </w:rPr>
+      </w:pPr>
+    </w:p>
+    <w:p>
+      <w:pPr>
+        <w:rPr>
+          <w:lang w:val="es-ES_tradnl"/>
+        </w:rPr>
+      </w:pPr>
+    </w:p>
+    <w:p>
+      <w:pPr>
+        <w:rPr>
+          <w:lang w:val="es-ES_tradnl"/>
+        </w:rPr>
+      </w:pPr>
+    </w:p>
+    <w:p>
+      <w:pPr>
+        <w:rPr>
+          <w:lang w:val="es-ES_tradnl"/>
+        </w:rPr>
+      </w:pPr>
+    </w:p>
+    <w:p>
+      <w:pPr>
+        <w:rPr>
+          <w:lang w:val="es-ES_tradnl"/>
+        </w:rPr>
+      </w:pPr>
+    </w:p>
+    <w:p>
+      <w:pPr>
+        <w:rPr>
+          <w:lang w:val="es-ES_tradnl"/>
+        </w:rPr>
+      </w:pPr>
+    </w:p>
+    <w:p>
+      <w:pPr>
+        <w:rPr>
+          <w:lang w:val="es-ES_tradnl"/>
+        </w:rPr>
+      </w:pPr>
+    </w:p>
+    <w:p>
+      <w:pPr>
+        <w:rPr>
+          <w:lang w:val="es-ES_tradnl"/>
+        </w:rPr>
+      </w:pPr>
+    </w:p>
+    <w:p>
+      <w:pPr>
+        <w:rPr>
+          <w:lang w:val="es-ES_tradnl"/>
+        </w:rPr>
+      </w:pPr>
+    </w:p>
+    <w:p>
+      <w:pPr>
+        <w:rPr>
+          <w:lang w:val="es-ES_tradnl"/>
+        </w:rPr>
+      </w:pPr>
+    </w:p>
+    <w:p>
+      <w:pPr>
+        <w:rPr>
+          <w:lang w:val="es-ES_tradnl"/>
+        </w:rPr>
+      </w:pPr>
+    </w:p>
+    <w:p>
+      <w:pPr>
+        <w:rPr>
+          <w:lang w:val="es-ES_tradnl"/>
+        </w:rPr>
+      </w:pPr>
+    </w:p>
+    <w:p>
+      <w:pPr>
+        <w:rPr>
+          <w:lang w:val="es-ES_tradnl"/>
+        </w:rPr>
+      </w:pPr>
+    </w:p>
+    <w:p>
+      <w:pPr>
+        <w:rPr>
+          <w:lang w:val="es-ES_tradnl"/>
+        </w:rPr>
+      </w:pPr>
+    </w:p>
+    <w:p>
+      <w:pPr>
+        <w:rPr>
+          <w:lang w:val="es-ES_tradnl"/>
+        </w:rPr>
+      </w:pPr>
+    </w:p>
+    <w:p>
+      <w:pPr>
+        <w:rPr>
+          <w:lang w:val="es-ES_tradnl"/>
+        </w:rPr>
+      </w:pPr>
+    </w:p>
+    <w:p>
+      <w:pPr>
+        <w:rPr>
+          <w:lang w:val="es-ES_tradnl"/>
+        </w:rPr>
+      </w:pPr>
+    </w:p>
+    <w:p>
+      <w:pPr>
+        <w:rPr>
+          <w:lang w:val="es-ES_tradnl"/>
+        </w:rPr>
+      </w:pPr>
+    </w:p>
+    <w:p>
+      <w:pPr>
+        <w:rPr>
+          <w:lang w:val="es-ES_tradnl"/>
+        </w:rPr>
+      </w:pPr>
+    </w:p>
+    <w:p>
+      <w:pPr>
+        <w:rPr>
+          <w:lang w:val="es-ES_tradnl"/>
+        </w:rPr>
+      </w:pPr>
+    </w:p>
+    <w:p>
+      <w:pPr>
+        <w:rPr>
+          <w:lang w:val="es-ES_tradnl"/>
+        </w:rPr>
+      </w:pPr>
+    </w:p>
+    <w:p>
+      <w:pPr>
+        <w:rPr>
+          <w:lang w:val="es-ES_tradnl"/>
+        </w:rPr>
+      </w:pPr>
+    </w:p>
+    <w:p>
+      <w:pPr>
+        <w:rPr>
+          <w:lang w:val="es-ES_tradnl"/>
+        </w:rPr>
+      </w:pPr>
+    </w:p>
+    <w:p>
+      <w:pPr>
+        <w:rPr>
+          <w:lang w:val="es-ES_tradnl"/>
+        </w:rPr>
+      </w:pPr>
+    </w:p>
+    <w:p>
+      <w:pPr>
+        <w:rPr>
+          <w:color w:val="EE0000"/>
+          <w:lang w:val="es-ES_tradnl"/>
+        </w:rPr>
+      </w:pPr>
+      <w:r>
+        <w:rPr>
+          <w:color w:val="EE0000"/>
+          <w:lang w:val="es-ES_tradnl"/>
+        </w:rPr>
+        <w:t>Conceptos nuevos/repaso:</w:t>
+      </w:r>
+    </w:p>
+    <w:p>
+      <w:pPr>
+        <w:pStyle w:val="Prrafodelista"/>
+        <w:numPr>
+          <w:ilvl w:val="0"/>
+          <w:numId w:val="2"/>
+        </w:numPr>
+        <w:rPr>
+          <w:lang w:val="es-ES_tradnl"/>
+        </w:rPr>
+      </w:pPr>
+      <w:r>
+        <w:rPr>
+          <w:b/>
+          <w:bCs/>
+          <w:lang w:val="es-ES_tradnl"/>
+        </w:rPr>
+        <w:lastRenderedPageBreak/>
+        <w:t>Parquet:</w:t>
+      </w:r>
+      <w:r>
+        <w:rPr>
+          <w:lang w:val="es-ES_tradnl"/>
+        </w:rPr>
+        <w:t xml:space="preserve"> formato de tabla comprimido que guarda los tipos de cada columna. Es el estándar para datos procesados.</w:t>
+      </w:r>
+    </w:p>
+    <w:p>
+      <w:pPr>
+        <w:pStyle w:val="Prrafodelista"/>
+        <w:numPr>
+          <w:ilvl w:val="0"/>
+          <w:numId w:val="2"/>
+        </w:numPr>
+        <w:rPr>
+          <w:lang w:val="es-ES_tradnl"/>
+        </w:rPr>
+      </w:pPr>
+      <w:r>
+        <w:rPr>
+          <w:b/>
+          <w:bCs/>
+          <w:lang w:val="es-ES_tradnl"/>
+        </w:rPr>
+        <w:t xml:space="preserve">Data </w:t>
+      </w:r>
+      <w:proofErr w:type="spellStart"/>
+      <w:r>
+        <w:rPr>
+          <w:b/>
+          <w:bCs/>
+          <w:lang w:val="es-ES_tradnl"/>
+        </w:rPr>
+        <w:t>leakage</w:t>
+      </w:r>
+      <w:proofErr w:type="spellEnd"/>
+      <w:r>
+        <w:rPr>
+          <w:b/>
+          <w:bCs/>
+          <w:lang w:val="es-ES_tradnl"/>
+        </w:rPr>
+        <w:t xml:space="preserve"> temporal:</w:t>
+      </w:r>
+      <w:r>
+        <w:rPr>
+          <w:lang w:val="es-ES_tradnl"/>
+        </w:rPr>
+        <w:t xml:space="preserve"> usar información posterior al momento de la predicción. Se evita usando solo datos hasta la fecha de cada fila.</w:t>
+      </w:r>
+    </w:p>
+    <w:p>
+      <w:pPr>
+        <w:pStyle w:val="Prrafodelista"/>
+        <w:numPr>
+          <w:ilvl w:val="0"/>
+          <w:numId w:val="2"/>
+        </w:numPr>
+        <w:rPr>
+          <w:lang w:val="es-ES_tradnl"/>
+        </w:rPr>
+      </w:pPr>
+      <w:proofErr w:type="spellStart"/>
+      <w:r>
+        <w:rPr>
+          <w:b/>
+          <w:bCs/>
+          <w:lang w:val="es-ES_tradnl"/>
+        </w:rPr>
+        <w:t>Feature</w:t>
+      </w:r>
+      <w:proofErr w:type="spellEnd"/>
+      <w:r>
+        <w:rPr>
+          <w:b/>
+          <w:bCs/>
+          <w:lang w:val="es-ES_tradnl"/>
+        </w:rPr>
+        <w:t xml:space="preserve"> </w:t>
+      </w:r>
+      <w:proofErr w:type="spellStart"/>
+      <w:r>
+        <w:rPr>
+          <w:b/>
+          <w:bCs/>
+          <w:lang w:val="es-ES_tradnl"/>
+        </w:rPr>
+        <w:t>engineering</w:t>
+      </w:r>
+      <w:proofErr w:type="spellEnd"/>
+      <w:r>
+        <w:rPr>
+          <w:b/>
+          <w:bCs/>
+          <w:lang w:val="es-ES_tradnl"/>
+        </w:rPr>
+        <w:t>:</w:t>
+      </w:r>
+      <w:r>
+        <w:rPr>
+          <w:lang w:val="es-ES_tradnl"/>
+        </w:rPr>
+        <w:t xml:space="preserve"> crear variables a partir de los datos para que el modelo pueda aprender. En series temporales, cada fila debe llevar su pasado como columnas (</w:t>
+      </w:r>
+      <w:proofErr w:type="spellStart"/>
+      <w:r>
+        <w:rPr>
+          <w:lang w:val="es-ES_tradnl"/>
+        </w:rPr>
+        <w:t>lags</w:t>
+      </w:r>
+      <w:proofErr w:type="spellEnd"/>
+      <w:r>
+        <w:rPr>
+          <w:lang w:val="es-ES_tradnl"/>
+        </w:rPr>
+        <w:t xml:space="preserve"> y acumulados).</w:t>
+      </w:r>
+    </w:p>
+    <w:p>
+      <w:pPr>
+        <w:pStyle w:val="Prrafodelista"/>
+        <w:numPr>
+          <w:ilvl w:val="0"/>
+          <w:numId w:val="2"/>
+        </w:numPr>
+        <w:rPr>
+          <w:lang w:val="es-ES_tradnl"/>
+        </w:rPr>
+      </w:pPr>
+      <w:proofErr w:type="spellStart"/>
+      <w:r>
+        <w:rPr>
+          <w:b/>
+          <w:bCs/>
+          <w:lang w:val="es-ES_tradnl"/>
+        </w:rPr>
+        <w:t>La</w:t>
+      </w:r>
+      <w:r>
+        <w:rPr>
+          <w:b/>
+          <w:bCs/>
           <w:lang w:val="es-ES_tradnl"/>
         </w:rPr>
         <w:t>g</w:t>
       </w:r>
+      <w:proofErr w:type="spellEnd"/>
       <w:r>
         <w:rPr>
           <w:b/>
@@ -2909,7 +4090,7 @@
         <w:rFonts w:ascii="Aptos" w:eastAsiaTheme="minorHAnsi" w:hAnsi="Aptos" w:cstheme="minorBidi" w:hint="default"/>
       </w:rPr>
     </w:lvl>
-    <w:lvl w:ilvl="1" w:tplc="040A0003" w:tentative="1">
+    <w:lvl w:ilvl="1" w:tplc="040A0003">
       <w:start w:val="1"/>
       <w:numFmt w:val="bullet"/>
       <w:lvlText w:val="o"/>

</xml_diff>